<commit_message>
Update A1.1 reports with ResNet18 evidence
</commit_message>
<xml_diff>
--- a/reports/A1_1_Bui_Tien_Duc_2680018.docx
+++ b/reports/A1_1_Bui_Tien_Duc_2680018.docx
@@ -52,7 +52,7 @@
     </w:p>
     <w:p>
       <w:r>
-        <w:t>Báo cáo chốt dữ liệu và kế hoạch so sánh ResNet-18 với ViT-Base/16, tập trung vào ảnh hưởng của khởi tạo pretrained và phạm vi đóng băng backbone. Đã kiểm tra môi trường GPU, đọc dữ liệu, thực hiện EDA và chạy thử pipeline ViT. Chưa có kết quả so sánh cuối của A1.2.</w:t>
+        <w:t>Báo cáo chốt dữ liệu và kế hoạch so sánh ResNet-18 với ViT-Base/16, tập trung vào ảnh hưởng của khởi tạo pretrained và phạm vi đóng băng backbone. Đã kiểm tra môi trường GPU, đọc dữ liệu, thực hiện EDA và chạy thử pipeline ViT và ResNet-18. Chưa có kết quả so sánh cuối của A1.2.</w:t>
       </w:r>
     </w:p>
     <w:p>
@@ -88,6 +88,7 @@
         <w:trPr>
           <w:cantSplit/>
           <w:tblHeader/>
+          <w:cantSplit/>
         </w:trPr>
         <w:tc>
           <w:tcPr>
@@ -99,6 +100,12 @@
               <w:right w:val="single" w:sz="4" w:color="D9D9D9"/>
             </w:tcBorders>
             <w:shd w:fill="DFE8F2"/>
+            <w:tcBorders>
+              <w:top w:val="single" w:sz="4" w:color="D9D9D9"/>
+              <w:left w:val="single" w:sz="4" w:color="D9D9D9"/>
+              <w:bottom w:val="single" w:sz="4" w:color="D9D9D9"/>
+              <w:right w:val="single" w:sz="4" w:color="D9D9D9"/>
+            </w:tcBorders>
           </w:tcPr>
           <w:p>
             <w:pPr>
@@ -123,6 +130,12 @@
               <w:right w:val="single" w:sz="4" w:color="D9D9D9"/>
             </w:tcBorders>
             <w:shd w:fill="DFE8F2"/>
+            <w:tcBorders>
+              <w:top w:val="single" w:sz="4" w:color="D9D9D9"/>
+              <w:left w:val="single" w:sz="4" w:color="D9D9D9"/>
+              <w:bottom w:val="single" w:sz="4" w:color="D9D9D9"/>
+              <w:right w:val="single" w:sz="4" w:color="D9D9D9"/>
+            </w:tcBorders>
           </w:tcPr>
           <w:p>
             <w:pPr>
@@ -147,6 +160,12 @@
               <w:right w:val="single" w:sz="4" w:color="D9D9D9"/>
             </w:tcBorders>
             <w:shd w:fill="DFE8F2"/>
+            <w:tcBorders>
+              <w:top w:val="single" w:sz="4" w:color="D9D9D9"/>
+              <w:left w:val="single" w:sz="4" w:color="D9D9D9"/>
+              <w:bottom w:val="single" w:sz="4" w:color="D9D9D9"/>
+              <w:right w:val="single" w:sz="4" w:color="D9D9D9"/>
+            </w:tcBorders>
           </w:tcPr>
           <w:p>
             <w:pPr>
@@ -165,10 +184,17 @@
       <w:tr>
         <w:trPr>
           <w:cantSplit/>
+          <w:cantSplit/>
         </w:trPr>
         <w:tc>
           <w:tcPr>
             <w:tcW w:type="dxa" w:w="1728"/>
+            <w:tcBorders>
+              <w:top w:val="single" w:sz="4" w:color="D9D9D9"/>
+              <w:left w:val="single" w:sz="4" w:color="D9D9D9"/>
+              <w:bottom w:val="single" w:sz="4" w:color="D9D9D9"/>
+              <w:right w:val="single" w:sz="4" w:color="D9D9D9"/>
+            </w:tcBorders>
             <w:tcBorders>
               <w:top w:val="single" w:sz="4" w:color="D9D9D9"/>
               <w:left w:val="single" w:sz="4" w:color="D9D9D9"/>
@@ -198,6 +224,12 @@
               <w:bottom w:val="single" w:sz="4" w:color="D9D9D9"/>
               <w:right w:val="single" w:sz="4" w:color="D9D9D9"/>
             </w:tcBorders>
+            <w:tcBorders>
+              <w:top w:val="single" w:sz="4" w:color="D9D9D9"/>
+              <w:left w:val="single" w:sz="4" w:color="D9D9D9"/>
+              <w:bottom w:val="single" w:sz="4" w:color="D9D9D9"/>
+              <w:right w:val="single" w:sz="4" w:color="D9D9D9"/>
+            </w:tcBorders>
           </w:tcPr>
           <w:p>
             <w:pPr>
@@ -215,6 +247,12 @@
         <w:tc>
           <w:tcPr>
             <w:tcW w:type="dxa" w:w="6768"/>
+            <w:tcBorders>
+              <w:top w:val="single" w:sz="4" w:color="D9D9D9"/>
+              <w:left w:val="single" w:sz="4" w:color="D9D9D9"/>
+              <w:bottom w:val="single" w:sz="4" w:color="D9D9D9"/>
+              <w:right w:val="single" w:sz="4" w:color="D9D9D9"/>
+            </w:tcBorders>
             <w:tcBorders>
               <w:top w:val="single" w:sz="4" w:color="D9D9D9"/>
               <w:left w:val="single" w:sz="4" w:color="D9D9D9"/>
@@ -239,10 +277,17 @@
       <w:tr>
         <w:trPr>
           <w:cantSplit/>
+          <w:cantSplit/>
         </w:trPr>
         <w:tc>
           <w:tcPr>
             <w:tcW w:type="dxa" w:w="1728"/>
+            <w:tcBorders>
+              <w:top w:val="single" w:sz="4" w:color="D9D9D9"/>
+              <w:left w:val="single" w:sz="4" w:color="D9D9D9"/>
+              <w:bottom w:val="single" w:sz="4" w:color="D9D9D9"/>
+              <w:right w:val="single" w:sz="4" w:color="D9D9D9"/>
+            </w:tcBorders>
             <w:tcBorders>
               <w:top w:val="single" w:sz="4" w:color="D9D9D9"/>
               <w:left w:val="single" w:sz="4" w:color="D9D9D9"/>
@@ -272,6 +317,12 @@
               <w:bottom w:val="single" w:sz="4" w:color="D9D9D9"/>
               <w:right w:val="single" w:sz="4" w:color="D9D9D9"/>
             </w:tcBorders>
+            <w:tcBorders>
+              <w:top w:val="single" w:sz="4" w:color="D9D9D9"/>
+              <w:left w:val="single" w:sz="4" w:color="D9D9D9"/>
+              <w:bottom w:val="single" w:sz="4" w:color="D9D9D9"/>
+              <w:right w:val="single" w:sz="4" w:color="D9D9D9"/>
+            </w:tcBorders>
           </w:tcPr>
           <w:p>
             <w:pPr>
@@ -289,6 +340,12 @@
         <w:tc>
           <w:tcPr>
             <w:tcW w:type="dxa" w:w="6768"/>
+            <w:tcBorders>
+              <w:top w:val="single" w:sz="4" w:color="D9D9D9"/>
+              <w:left w:val="single" w:sz="4" w:color="D9D9D9"/>
+              <w:bottom w:val="single" w:sz="4" w:color="D9D9D9"/>
+              <w:right w:val="single" w:sz="4" w:color="D9D9D9"/>
+            </w:tcBorders>
             <w:tcBorders>
               <w:top w:val="single" w:sz="4" w:color="D9D9D9"/>
               <w:left w:val="single" w:sz="4" w:color="D9D9D9"/>
@@ -313,10 +370,17 @@
       <w:tr>
         <w:trPr>
           <w:cantSplit/>
+          <w:cantSplit/>
         </w:trPr>
         <w:tc>
           <w:tcPr>
             <w:tcW w:type="dxa" w:w="1728"/>
+            <w:tcBorders>
+              <w:top w:val="single" w:sz="4" w:color="D9D9D9"/>
+              <w:left w:val="single" w:sz="4" w:color="D9D9D9"/>
+              <w:bottom w:val="single" w:sz="4" w:color="D9D9D9"/>
+              <w:right w:val="single" w:sz="4" w:color="D9D9D9"/>
+            </w:tcBorders>
             <w:tcBorders>
               <w:top w:val="single" w:sz="4" w:color="D9D9D9"/>
               <w:left w:val="single" w:sz="4" w:color="D9D9D9"/>
@@ -346,6 +410,12 @@
               <w:bottom w:val="single" w:sz="4" w:color="D9D9D9"/>
               <w:right w:val="single" w:sz="4" w:color="D9D9D9"/>
             </w:tcBorders>
+            <w:tcBorders>
+              <w:top w:val="single" w:sz="4" w:color="D9D9D9"/>
+              <w:left w:val="single" w:sz="4" w:color="D9D9D9"/>
+              <w:bottom w:val="single" w:sz="4" w:color="D9D9D9"/>
+              <w:right w:val="single" w:sz="4" w:color="D9D9D9"/>
+            </w:tcBorders>
           </w:tcPr>
           <w:p>
             <w:pPr>
@@ -363,6 +433,12 @@
         <w:tc>
           <w:tcPr>
             <w:tcW w:type="dxa" w:w="6768"/>
+            <w:tcBorders>
+              <w:top w:val="single" w:sz="4" w:color="D9D9D9"/>
+              <w:left w:val="single" w:sz="4" w:color="D9D9D9"/>
+              <w:bottom w:val="single" w:sz="4" w:color="D9D9D9"/>
+              <w:right w:val="single" w:sz="4" w:color="D9D9D9"/>
+            </w:tcBorders>
             <w:tcBorders>
               <w:top w:val="single" w:sz="4" w:color="D9D9D9"/>
               <w:left w:val="single" w:sz="4" w:color="D9D9D9"/>
@@ -387,10 +463,17 @@
       <w:tr>
         <w:trPr>
           <w:cantSplit/>
+          <w:cantSplit/>
         </w:trPr>
         <w:tc>
           <w:tcPr>
             <w:tcW w:type="dxa" w:w="1728"/>
+            <w:tcBorders>
+              <w:top w:val="single" w:sz="4" w:color="D9D9D9"/>
+              <w:left w:val="single" w:sz="4" w:color="D9D9D9"/>
+              <w:bottom w:val="single" w:sz="4" w:color="D9D9D9"/>
+              <w:right w:val="single" w:sz="4" w:color="D9D9D9"/>
+            </w:tcBorders>
             <w:tcBorders>
               <w:top w:val="single" w:sz="4" w:color="D9D9D9"/>
               <w:left w:val="single" w:sz="4" w:color="D9D9D9"/>
@@ -420,6 +503,12 @@
               <w:bottom w:val="single" w:sz="4" w:color="D9D9D9"/>
               <w:right w:val="single" w:sz="4" w:color="D9D9D9"/>
             </w:tcBorders>
+            <w:tcBorders>
+              <w:top w:val="single" w:sz="4" w:color="D9D9D9"/>
+              <w:left w:val="single" w:sz="4" w:color="D9D9D9"/>
+              <w:bottom w:val="single" w:sz="4" w:color="D9D9D9"/>
+              <w:right w:val="single" w:sz="4" w:color="D9D9D9"/>
+            </w:tcBorders>
           </w:tcPr>
           <w:p>
             <w:pPr>
@@ -437,6 +526,12 @@
         <w:tc>
           <w:tcPr>
             <w:tcW w:type="dxa" w:w="6768"/>
+            <w:tcBorders>
+              <w:top w:val="single" w:sz="4" w:color="D9D9D9"/>
+              <w:left w:val="single" w:sz="4" w:color="D9D9D9"/>
+              <w:bottom w:val="single" w:sz="4" w:color="D9D9D9"/>
+              <w:right w:val="single" w:sz="4" w:color="D9D9D9"/>
+            </w:tcBorders>
             <w:tcBorders>
               <w:top w:val="single" w:sz="4" w:color="D9D9D9"/>
               <w:left w:val="single" w:sz="4" w:color="D9D9D9"/>
@@ -499,6 +594,7 @@
         <w:trPr>
           <w:cantSplit/>
           <w:tblHeader/>
+          <w:cantSplit/>
         </w:trPr>
         <w:tc>
           <w:tcPr>
@@ -510,6 +606,12 @@
               <w:right w:val="single" w:sz="4" w:color="D9D9D9"/>
             </w:tcBorders>
             <w:shd w:fill="DFE8F2"/>
+            <w:tcBorders>
+              <w:top w:val="single" w:sz="4" w:color="D9D9D9"/>
+              <w:left w:val="single" w:sz="4" w:color="D9D9D9"/>
+              <w:bottom w:val="single" w:sz="4" w:color="D9D9D9"/>
+              <w:right w:val="single" w:sz="4" w:color="D9D9D9"/>
+            </w:tcBorders>
           </w:tcPr>
           <w:p>
             <w:pPr>
@@ -534,6 +636,12 @@
               <w:right w:val="single" w:sz="4" w:color="D9D9D9"/>
             </w:tcBorders>
             <w:shd w:fill="DFE8F2"/>
+            <w:tcBorders>
+              <w:top w:val="single" w:sz="4" w:color="D9D9D9"/>
+              <w:left w:val="single" w:sz="4" w:color="D9D9D9"/>
+              <w:bottom w:val="single" w:sz="4" w:color="D9D9D9"/>
+              <w:right w:val="single" w:sz="4" w:color="D9D9D9"/>
+            </w:tcBorders>
           </w:tcPr>
           <w:p>
             <w:pPr>
@@ -558,6 +666,12 @@
               <w:right w:val="single" w:sz="4" w:color="D9D9D9"/>
             </w:tcBorders>
             <w:shd w:fill="DFE8F2"/>
+            <w:tcBorders>
+              <w:top w:val="single" w:sz="4" w:color="D9D9D9"/>
+              <w:left w:val="single" w:sz="4" w:color="D9D9D9"/>
+              <w:bottom w:val="single" w:sz="4" w:color="D9D9D9"/>
+              <w:right w:val="single" w:sz="4" w:color="D9D9D9"/>
+            </w:tcBorders>
           </w:tcPr>
           <w:p>
             <w:pPr>
@@ -582,6 +696,12 @@
               <w:right w:val="single" w:sz="4" w:color="D9D9D9"/>
             </w:tcBorders>
             <w:shd w:fill="DFE8F2"/>
+            <w:tcBorders>
+              <w:top w:val="single" w:sz="4" w:color="D9D9D9"/>
+              <w:left w:val="single" w:sz="4" w:color="D9D9D9"/>
+              <w:bottom w:val="single" w:sz="4" w:color="D9D9D9"/>
+              <w:right w:val="single" w:sz="4" w:color="D9D9D9"/>
+            </w:tcBorders>
           </w:tcPr>
           <w:p>
             <w:pPr>
@@ -606,6 +726,12 @@
               <w:right w:val="single" w:sz="4" w:color="D9D9D9"/>
             </w:tcBorders>
             <w:shd w:fill="DFE8F2"/>
+            <w:tcBorders>
+              <w:top w:val="single" w:sz="4" w:color="D9D9D9"/>
+              <w:left w:val="single" w:sz="4" w:color="D9D9D9"/>
+              <w:bottom w:val="single" w:sz="4" w:color="D9D9D9"/>
+              <w:right w:val="single" w:sz="4" w:color="D9D9D9"/>
+            </w:tcBorders>
           </w:tcPr>
           <w:p>
             <w:pPr>
@@ -624,10 +750,17 @@
       <w:tr>
         <w:trPr>
           <w:cantSplit/>
+          <w:cantSplit/>
         </w:trPr>
         <w:tc>
           <w:tcPr>
             <w:tcW w:type="dxa" w:w="576"/>
+            <w:tcBorders>
+              <w:top w:val="single" w:sz="4" w:color="D9D9D9"/>
+              <w:left w:val="single" w:sz="4" w:color="D9D9D9"/>
+              <w:bottom w:val="single" w:sz="4" w:color="D9D9D9"/>
+              <w:right w:val="single" w:sz="4" w:color="D9D9D9"/>
+            </w:tcBorders>
             <w:tcBorders>
               <w:top w:val="single" w:sz="4" w:color="D9D9D9"/>
               <w:left w:val="single" w:sz="4" w:color="D9D9D9"/>
@@ -657,6 +790,12 @@
               <w:bottom w:val="single" w:sz="4" w:color="D9D9D9"/>
               <w:right w:val="single" w:sz="4" w:color="D9D9D9"/>
             </w:tcBorders>
+            <w:tcBorders>
+              <w:top w:val="single" w:sz="4" w:color="D9D9D9"/>
+              <w:left w:val="single" w:sz="4" w:color="D9D9D9"/>
+              <w:bottom w:val="single" w:sz="4" w:color="D9D9D9"/>
+              <w:right w:val="single" w:sz="4" w:color="D9D9D9"/>
+            </w:tcBorders>
           </w:tcPr>
           <w:p>
             <w:pPr>
@@ -674,6 +813,12 @@
         <w:tc>
           <w:tcPr>
             <w:tcW w:type="dxa" w:w="1440"/>
+            <w:tcBorders>
+              <w:top w:val="single" w:sz="4" w:color="D9D9D9"/>
+              <w:left w:val="single" w:sz="4" w:color="D9D9D9"/>
+              <w:bottom w:val="single" w:sz="4" w:color="D9D9D9"/>
+              <w:right w:val="single" w:sz="4" w:color="D9D9D9"/>
+            </w:tcBorders>
             <w:tcBorders>
               <w:top w:val="single" w:sz="4" w:color="D9D9D9"/>
               <w:left w:val="single" w:sz="4" w:color="D9D9D9"/>
@@ -703,6 +848,12 @@
               <w:bottom w:val="single" w:sz="4" w:color="D9D9D9"/>
               <w:right w:val="single" w:sz="4" w:color="D9D9D9"/>
             </w:tcBorders>
+            <w:tcBorders>
+              <w:top w:val="single" w:sz="4" w:color="D9D9D9"/>
+              <w:left w:val="single" w:sz="4" w:color="D9D9D9"/>
+              <w:bottom w:val="single" w:sz="4" w:color="D9D9D9"/>
+              <w:right w:val="single" w:sz="4" w:color="D9D9D9"/>
+            </w:tcBorders>
           </w:tcPr>
           <w:p>
             <w:pPr>
@@ -720,6 +871,12 @@
         <w:tc>
           <w:tcPr>
             <w:tcW w:type="dxa" w:w="1584"/>
+            <w:tcBorders>
+              <w:top w:val="single" w:sz="4" w:color="D9D9D9"/>
+              <w:left w:val="single" w:sz="4" w:color="D9D9D9"/>
+              <w:bottom w:val="single" w:sz="4" w:color="D9D9D9"/>
+              <w:right w:val="single" w:sz="4" w:color="D9D9D9"/>
+            </w:tcBorders>
             <w:tcBorders>
               <w:top w:val="single" w:sz="4" w:color="D9D9D9"/>
               <w:left w:val="single" w:sz="4" w:color="D9D9D9"/>
@@ -744,10 +901,17 @@
       <w:tr>
         <w:trPr>
           <w:cantSplit/>
+          <w:cantSplit/>
         </w:trPr>
         <w:tc>
           <w:tcPr>
             <w:tcW w:type="dxa" w:w="576"/>
+            <w:tcBorders>
+              <w:top w:val="single" w:sz="4" w:color="D9D9D9"/>
+              <w:left w:val="single" w:sz="4" w:color="D9D9D9"/>
+              <w:bottom w:val="single" w:sz="4" w:color="D9D9D9"/>
+              <w:right w:val="single" w:sz="4" w:color="D9D9D9"/>
+            </w:tcBorders>
             <w:tcBorders>
               <w:top w:val="single" w:sz="4" w:color="D9D9D9"/>
               <w:left w:val="single" w:sz="4" w:color="D9D9D9"/>
@@ -777,6 +941,12 @@
               <w:bottom w:val="single" w:sz="4" w:color="D9D9D9"/>
               <w:right w:val="single" w:sz="4" w:color="D9D9D9"/>
             </w:tcBorders>
+            <w:tcBorders>
+              <w:top w:val="single" w:sz="4" w:color="D9D9D9"/>
+              <w:left w:val="single" w:sz="4" w:color="D9D9D9"/>
+              <w:bottom w:val="single" w:sz="4" w:color="D9D9D9"/>
+              <w:right w:val="single" w:sz="4" w:color="D9D9D9"/>
+            </w:tcBorders>
           </w:tcPr>
           <w:p>
             <w:pPr>
@@ -794,6 +964,12 @@
         <w:tc>
           <w:tcPr>
             <w:tcW w:type="dxa" w:w="1440"/>
+            <w:tcBorders>
+              <w:top w:val="single" w:sz="4" w:color="D9D9D9"/>
+              <w:left w:val="single" w:sz="4" w:color="D9D9D9"/>
+              <w:bottom w:val="single" w:sz="4" w:color="D9D9D9"/>
+              <w:right w:val="single" w:sz="4" w:color="D9D9D9"/>
+            </w:tcBorders>
             <w:tcBorders>
               <w:top w:val="single" w:sz="4" w:color="D9D9D9"/>
               <w:left w:val="single" w:sz="4" w:color="D9D9D9"/>
@@ -823,6 +999,12 @@
               <w:bottom w:val="single" w:sz="4" w:color="D9D9D9"/>
               <w:right w:val="single" w:sz="4" w:color="D9D9D9"/>
             </w:tcBorders>
+            <w:tcBorders>
+              <w:top w:val="single" w:sz="4" w:color="D9D9D9"/>
+              <w:left w:val="single" w:sz="4" w:color="D9D9D9"/>
+              <w:bottom w:val="single" w:sz="4" w:color="D9D9D9"/>
+              <w:right w:val="single" w:sz="4" w:color="D9D9D9"/>
+            </w:tcBorders>
           </w:tcPr>
           <w:p>
             <w:pPr>
@@ -840,6 +1022,12 @@
         <w:tc>
           <w:tcPr>
             <w:tcW w:type="dxa" w:w="1584"/>
+            <w:tcBorders>
+              <w:top w:val="single" w:sz="4" w:color="D9D9D9"/>
+              <w:left w:val="single" w:sz="4" w:color="D9D9D9"/>
+              <w:bottom w:val="single" w:sz="4" w:color="D9D9D9"/>
+              <w:right w:val="single" w:sz="4" w:color="D9D9D9"/>
+            </w:tcBorders>
             <w:tcBorders>
               <w:top w:val="single" w:sz="4" w:color="D9D9D9"/>
               <w:left w:val="single" w:sz="4" w:color="D9D9D9"/>
@@ -864,10 +1052,17 @@
       <w:tr>
         <w:trPr>
           <w:cantSplit/>
+          <w:cantSplit/>
         </w:trPr>
         <w:tc>
           <w:tcPr>
             <w:tcW w:type="dxa" w:w="576"/>
+            <w:tcBorders>
+              <w:top w:val="single" w:sz="4" w:color="D9D9D9"/>
+              <w:left w:val="single" w:sz="4" w:color="D9D9D9"/>
+              <w:bottom w:val="single" w:sz="4" w:color="D9D9D9"/>
+              <w:right w:val="single" w:sz="4" w:color="D9D9D9"/>
+            </w:tcBorders>
             <w:tcBorders>
               <w:top w:val="single" w:sz="4" w:color="D9D9D9"/>
               <w:left w:val="single" w:sz="4" w:color="D9D9D9"/>
@@ -897,6 +1092,12 @@
               <w:bottom w:val="single" w:sz="4" w:color="D9D9D9"/>
               <w:right w:val="single" w:sz="4" w:color="D9D9D9"/>
             </w:tcBorders>
+            <w:tcBorders>
+              <w:top w:val="single" w:sz="4" w:color="D9D9D9"/>
+              <w:left w:val="single" w:sz="4" w:color="D9D9D9"/>
+              <w:bottom w:val="single" w:sz="4" w:color="D9D9D9"/>
+              <w:right w:val="single" w:sz="4" w:color="D9D9D9"/>
+            </w:tcBorders>
           </w:tcPr>
           <w:p>
             <w:pPr>
@@ -914,6 +1115,12 @@
         <w:tc>
           <w:tcPr>
             <w:tcW w:type="dxa" w:w="1440"/>
+            <w:tcBorders>
+              <w:top w:val="single" w:sz="4" w:color="D9D9D9"/>
+              <w:left w:val="single" w:sz="4" w:color="D9D9D9"/>
+              <w:bottom w:val="single" w:sz="4" w:color="D9D9D9"/>
+              <w:right w:val="single" w:sz="4" w:color="D9D9D9"/>
+            </w:tcBorders>
             <w:tcBorders>
               <w:top w:val="single" w:sz="4" w:color="D9D9D9"/>
               <w:left w:val="single" w:sz="4" w:color="D9D9D9"/>
@@ -943,6 +1150,12 @@
               <w:bottom w:val="single" w:sz="4" w:color="D9D9D9"/>
               <w:right w:val="single" w:sz="4" w:color="D9D9D9"/>
             </w:tcBorders>
+            <w:tcBorders>
+              <w:top w:val="single" w:sz="4" w:color="D9D9D9"/>
+              <w:left w:val="single" w:sz="4" w:color="D9D9D9"/>
+              <w:bottom w:val="single" w:sz="4" w:color="D9D9D9"/>
+              <w:right w:val="single" w:sz="4" w:color="D9D9D9"/>
+            </w:tcBorders>
           </w:tcPr>
           <w:p>
             <w:pPr>
@@ -960,6 +1173,12 @@
         <w:tc>
           <w:tcPr>
             <w:tcW w:type="dxa" w:w="1584"/>
+            <w:tcBorders>
+              <w:top w:val="single" w:sz="4" w:color="D9D9D9"/>
+              <w:left w:val="single" w:sz="4" w:color="D9D9D9"/>
+              <w:bottom w:val="single" w:sz="4" w:color="D9D9D9"/>
+              <w:right w:val="single" w:sz="4" w:color="D9D9D9"/>
+            </w:tcBorders>
             <w:tcBorders>
               <w:top w:val="single" w:sz="4" w:color="D9D9D9"/>
               <w:left w:val="single" w:sz="4" w:color="D9D9D9"/>
@@ -984,10 +1203,17 @@
       <w:tr>
         <w:trPr>
           <w:cantSplit/>
+          <w:cantSplit/>
         </w:trPr>
         <w:tc>
           <w:tcPr>
             <w:tcW w:type="dxa" w:w="576"/>
+            <w:tcBorders>
+              <w:top w:val="single" w:sz="4" w:color="D9D9D9"/>
+              <w:left w:val="single" w:sz="4" w:color="D9D9D9"/>
+              <w:bottom w:val="single" w:sz="4" w:color="D9D9D9"/>
+              <w:right w:val="single" w:sz="4" w:color="D9D9D9"/>
+            </w:tcBorders>
             <w:tcBorders>
               <w:top w:val="single" w:sz="4" w:color="D9D9D9"/>
               <w:left w:val="single" w:sz="4" w:color="D9D9D9"/>
@@ -1017,6 +1243,12 @@
               <w:bottom w:val="single" w:sz="4" w:color="D9D9D9"/>
               <w:right w:val="single" w:sz="4" w:color="D9D9D9"/>
             </w:tcBorders>
+            <w:tcBorders>
+              <w:top w:val="single" w:sz="4" w:color="D9D9D9"/>
+              <w:left w:val="single" w:sz="4" w:color="D9D9D9"/>
+              <w:bottom w:val="single" w:sz="4" w:color="D9D9D9"/>
+              <w:right w:val="single" w:sz="4" w:color="D9D9D9"/>
+            </w:tcBorders>
           </w:tcPr>
           <w:p>
             <w:pPr>
@@ -1034,6 +1266,12 @@
         <w:tc>
           <w:tcPr>
             <w:tcW w:type="dxa" w:w="1440"/>
+            <w:tcBorders>
+              <w:top w:val="single" w:sz="4" w:color="D9D9D9"/>
+              <w:left w:val="single" w:sz="4" w:color="D9D9D9"/>
+              <w:bottom w:val="single" w:sz="4" w:color="D9D9D9"/>
+              <w:right w:val="single" w:sz="4" w:color="D9D9D9"/>
+            </w:tcBorders>
             <w:tcBorders>
               <w:top w:val="single" w:sz="4" w:color="D9D9D9"/>
               <w:left w:val="single" w:sz="4" w:color="D9D9D9"/>
@@ -1063,6 +1301,12 @@
               <w:bottom w:val="single" w:sz="4" w:color="D9D9D9"/>
               <w:right w:val="single" w:sz="4" w:color="D9D9D9"/>
             </w:tcBorders>
+            <w:tcBorders>
+              <w:top w:val="single" w:sz="4" w:color="D9D9D9"/>
+              <w:left w:val="single" w:sz="4" w:color="D9D9D9"/>
+              <w:bottom w:val="single" w:sz="4" w:color="D9D9D9"/>
+              <w:right w:val="single" w:sz="4" w:color="D9D9D9"/>
+            </w:tcBorders>
           </w:tcPr>
           <w:p>
             <w:pPr>
@@ -1080,6 +1324,12 @@
         <w:tc>
           <w:tcPr>
             <w:tcW w:type="dxa" w:w="1584"/>
+            <w:tcBorders>
+              <w:top w:val="single" w:sz="4" w:color="D9D9D9"/>
+              <w:left w:val="single" w:sz="4" w:color="D9D9D9"/>
+              <w:bottom w:val="single" w:sz="4" w:color="D9D9D9"/>
+              <w:right w:val="single" w:sz="4" w:color="D9D9D9"/>
+            </w:tcBorders>
             <w:tcBorders>
               <w:top w:val="single" w:sz="4" w:color="D9D9D9"/>
               <w:left w:val="single" w:sz="4" w:color="D9D9D9"/>
@@ -1104,10 +1354,17 @@
       <w:tr>
         <w:trPr>
           <w:cantSplit/>
+          <w:cantSplit/>
         </w:trPr>
         <w:tc>
           <w:tcPr>
             <w:tcW w:type="dxa" w:w="576"/>
+            <w:tcBorders>
+              <w:top w:val="single" w:sz="4" w:color="D9D9D9"/>
+              <w:left w:val="single" w:sz="4" w:color="D9D9D9"/>
+              <w:bottom w:val="single" w:sz="4" w:color="D9D9D9"/>
+              <w:right w:val="single" w:sz="4" w:color="D9D9D9"/>
+            </w:tcBorders>
             <w:tcBorders>
               <w:top w:val="single" w:sz="4" w:color="D9D9D9"/>
               <w:left w:val="single" w:sz="4" w:color="D9D9D9"/>
@@ -1137,6 +1394,12 @@
               <w:bottom w:val="single" w:sz="4" w:color="D9D9D9"/>
               <w:right w:val="single" w:sz="4" w:color="D9D9D9"/>
             </w:tcBorders>
+            <w:tcBorders>
+              <w:top w:val="single" w:sz="4" w:color="D9D9D9"/>
+              <w:left w:val="single" w:sz="4" w:color="D9D9D9"/>
+              <w:bottom w:val="single" w:sz="4" w:color="D9D9D9"/>
+              <w:right w:val="single" w:sz="4" w:color="D9D9D9"/>
+            </w:tcBorders>
           </w:tcPr>
           <w:p>
             <w:pPr>
@@ -1154,6 +1417,12 @@
         <w:tc>
           <w:tcPr>
             <w:tcW w:type="dxa" w:w="1440"/>
+            <w:tcBorders>
+              <w:top w:val="single" w:sz="4" w:color="D9D9D9"/>
+              <w:left w:val="single" w:sz="4" w:color="D9D9D9"/>
+              <w:bottom w:val="single" w:sz="4" w:color="D9D9D9"/>
+              <w:right w:val="single" w:sz="4" w:color="D9D9D9"/>
+            </w:tcBorders>
             <w:tcBorders>
               <w:top w:val="single" w:sz="4" w:color="D9D9D9"/>
               <w:left w:val="single" w:sz="4" w:color="D9D9D9"/>
@@ -1183,6 +1452,12 @@
               <w:bottom w:val="single" w:sz="4" w:color="D9D9D9"/>
               <w:right w:val="single" w:sz="4" w:color="D9D9D9"/>
             </w:tcBorders>
+            <w:tcBorders>
+              <w:top w:val="single" w:sz="4" w:color="D9D9D9"/>
+              <w:left w:val="single" w:sz="4" w:color="D9D9D9"/>
+              <w:bottom w:val="single" w:sz="4" w:color="D9D9D9"/>
+              <w:right w:val="single" w:sz="4" w:color="D9D9D9"/>
+            </w:tcBorders>
           </w:tcPr>
           <w:p>
             <w:pPr>
@@ -1200,6 +1475,12 @@
         <w:tc>
           <w:tcPr>
             <w:tcW w:type="dxa" w:w="1584"/>
+            <w:tcBorders>
+              <w:top w:val="single" w:sz="4" w:color="D9D9D9"/>
+              <w:left w:val="single" w:sz="4" w:color="D9D9D9"/>
+              <w:bottom w:val="single" w:sz="4" w:color="D9D9D9"/>
+              <w:right w:val="single" w:sz="4" w:color="D9D9D9"/>
+            </w:tcBorders>
             <w:tcBorders>
               <w:top w:val="single" w:sz="4" w:color="D9D9D9"/>
               <w:left w:val="single" w:sz="4" w:color="D9D9D9"/>
@@ -1224,10 +1505,17 @@
       <w:tr>
         <w:trPr>
           <w:cantSplit/>
+          <w:cantSplit/>
         </w:trPr>
         <w:tc>
           <w:tcPr>
             <w:tcW w:type="dxa" w:w="576"/>
+            <w:tcBorders>
+              <w:top w:val="single" w:sz="4" w:color="D9D9D9"/>
+              <w:left w:val="single" w:sz="4" w:color="D9D9D9"/>
+              <w:bottom w:val="single" w:sz="4" w:color="D9D9D9"/>
+              <w:right w:val="single" w:sz="4" w:color="D9D9D9"/>
+            </w:tcBorders>
             <w:tcBorders>
               <w:top w:val="single" w:sz="4" w:color="D9D9D9"/>
               <w:left w:val="single" w:sz="4" w:color="D9D9D9"/>
@@ -1257,6 +1545,12 @@
               <w:bottom w:val="single" w:sz="4" w:color="D9D9D9"/>
               <w:right w:val="single" w:sz="4" w:color="D9D9D9"/>
             </w:tcBorders>
+            <w:tcBorders>
+              <w:top w:val="single" w:sz="4" w:color="D9D9D9"/>
+              <w:left w:val="single" w:sz="4" w:color="D9D9D9"/>
+              <w:bottom w:val="single" w:sz="4" w:color="D9D9D9"/>
+              <w:right w:val="single" w:sz="4" w:color="D9D9D9"/>
+            </w:tcBorders>
           </w:tcPr>
           <w:p>
             <w:pPr>
@@ -1274,6 +1568,12 @@
         <w:tc>
           <w:tcPr>
             <w:tcW w:type="dxa" w:w="1440"/>
+            <w:tcBorders>
+              <w:top w:val="single" w:sz="4" w:color="D9D9D9"/>
+              <w:left w:val="single" w:sz="4" w:color="D9D9D9"/>
+              <w:bottom w:val="single" w:sz="4" w:color="D9D9D9"/>
+              <w:right w:val="single" w:sz="4" w:color="D9D9D9"/>
+            </w:tcBorders>
             <w:tcBorders>
               <w:top w:val="single" w:sz="4" w:color="D9D9D9"/>
               <w:left w:val="single" w:sz="4" w:color="D9D9D9"/>
@@ -1303,6 +1603,12 @@
               <w:bottom w:val="single" w:sz="4" w:color="D9D9D9"/>
               <w:right w:val="single" w:sz="4" w:color="D9D9D9"/>
             </w:tcBorders>
+            <w:tcBorders>
+              <w:top w:val="single" w:sz="4" w:color="D9D9D9"/>
+              <w:left w:val="single" w:sz="4" w:color="D9D9D9"/>
+              <w:bottom w:val="single" w:sz="4" w:color="D9D9D9"/>
+              <w:right w:val="single" w:sz="4" w:color="D9D9D9"/>
+            </w:tcBorders>
           </w:tcPr>
           <w:p>
             <w:pPr>
@@ -1320,6 +1626,12 @@
         <w:tc>
           <w:tcPr>
             <w:tcW w:type="dxa" w:w="1584"/>
+            <w:tcBorders>
+              <w:top w:val="single" w:sz="4" w:color="D9D9D9"/>
+              <w:left w:val="single" w:sz="4" w:color="D9D9D9"/>
+              <w:bottom w:val="single" w:sz="4" w:color="D9D9D9"/>
+              <w:right w:val="single" w:sz="4" w:color="D9D9D9"/>
+            </w:tcBorders>
             <w:tcBorders>
               <w:top w:val="single" w:sz="4" w:color="D9D9D9"/>
               <w:left w:val="single" w:sz="4" w:color="D9D9D9"/>
@@ -1344,10 +1656,17 @@
       <w:tr>
         <w:trPr>
           <w:cantSplit/>
+          <w:cantSplit/>
         </w:trPr>
         <w:tc>
           <w:tcPr>
             <w:tcW w:type="dxa" w:w="576"/>
+            <w:tcBorders>
+              <w:top w:val="single" w:sz="4" w:color="D9D9D9"/>
+              <w:left w:val="single" w:sz="4" w:color="D9D9D9"/>
+              <w:bottom w:val="single" w:sz="4" w:color="D9D9D9"/>
+              <w:right w:val="single" w:sz="4" w:color="D9D9D9"/>
+            </w:tcBorders>
             <w:tcBorders>
               <w:top w:val="single" w:sz="4" w:color="D9D9D9"/>
               <w:left w:val="single" w:sz="4" w:color="D9D9D9"/>
@@ -1377,6 +1696,12 @@
               <w:bottom w:val="single" w:sz="4" w:color="D9D9D9"/>
               <w:right w:val="single" w:sz="4" w:color="D9D9D9"/>
             </w:tcBorders>
+            <w:tcBorders>
+              <w:top w:val="single" w:sz="4" w:color="D9D9D9"/>
+              <w:left w:val="single" w:sz="4" w:color="D9D9D9"/>
+              <w:bottom w:val="single" w:sz="4" w:color="D9D9D9"/>
+              <w:right w:val="single" w:sz="4" w:color="D9D9D9"/>
+            </w:tcBorders>
           </w:tcPr>
           <w:p>
             <w:pPr>
@@ -1394,6 +1719,12 @@
         <w:tc>
           <w:tcPr>
             <w:tcW w:type="dxa" w:w="1440"/>
+            <w:tcBorders>
+              <w:top w:val="single" w:sz="4" w:color="D9D9D9"/>
+              <w:left w:val="single" w:sz="4" w:color="D9D9D9"/>
+              <w:bottom w:val="single" w:sz="4" w:color="D9D9D9"/>
+              <w:right w:val="single" w:sz="4" w:color="D9D9D9"/>
+            </w:tcBorders>
             <w:tcBorders>
               <w:top w:val="single" w:sz="4" w:color="D9D9D9"/>
               <w:left w:val="single" w:sz="4" w:color="D9D9D9"/>
@@ -1423,6 +1754,12 @@
               <w:bottom w:val="single" w:sz="4" w:color="D9D9D9"/>
               <w:right w:val="single" w:sz="4" w:color="D9D9D9"/>
             </w:tcBorders>
+            <w:tcBorders>
+              <w:top w:val="single" w:sz="4" w:color="D9D9D9"/>
+              <w:left w:val="single" w:sz="4" w:color="D9D9D9"/>
+              <w:bottom w:val="single" w:sz="4" w:color="D9D9D9"/>
+              <w:right w:val="single" w:sz="4" w:color="D9D9D9"/>
+            </w:tcBorders>
           </w:tcPr>
           <w:p>
             <w:pPr>
@@ -1440,6 +1777,12 @@
         <w:tc>
           <w:tcPr>
             <w:tcW w:type="dxa" w:w="1584"/>
+            <w:tcBorders>
+              <w:top w:val="single" w:sz="4" w:color="D9D9D9"/>
+              <w:left w:val="single" w:sz="4" w:color="D9D9D9"/>
+              <w:bottom w:val="single" w:sz="4" w:color="D9D9D9"/>
+              <w:right w:val="single" w:sz="4" w:color="D9D9D9"/>
+            </w:tcBorders>
             <w:tcBorders>
               <w:top w:val="single" w:sz="4" w:color="D9D9D9"/>
               <w:left w:val="single" w:sz="4" w:color="D9D9D9"/>
@@ -1464,10 +1807,17 @@
       <w:tr>
         <w:trPr>
           <w:cantSplit/>
+          <w:cantSplit/>
         </w:trPr>
         <w:tc>
           <w:tcPr>
             <w:tcW w:type="dxa" w:w="576"/>
+            <w:tcBorders>
+              <w:top w:val="single" w:sz="4" w:color="D9D9D9"/>
+              <w:left w:val="single" w:sz="4" w:color="D9D9D9"/>
+              <w:bottom w:val="single" w:sz="4" w:color="D9D9D9"/>
+              <w:right w:val="single" w:sz="4" w:color="D9D9D9"/>
+            </w:tcBorders>
             <w:tcBorders>
               <w:top w:val="single" w:sz="4" w:color="D9D9D9"/>
               <w:left w:val="single" w:sz="4" w:color="D9D9D9"/>
@@ -1497,6 +1847,12 @@
               <w:bottom w:val="single" w:sz="4" w:color="D9D9D9"/>
               <w:right w:val="single" w:sz="4" w:color="D9D9D9"/>
             </w:tcBorders>
+            <w:tcBorders>
+              <w:top w:val="single" w:sz="4" w:color="D9D9D9"/>
+              <w:left w:val="single" w:sz="4" w:color="D9D9D9"/>
+              <w:bottom w:val="single" w:sz="4" w:color="D9D9D9"/>
+              <w:right w:val="single" w:sz="4" w:color="D9D9D9"/>
+            </w:tcBorders>
           </w:tcPr>
           <w:p>
             <w:pPr>
@@ -1514,6 +1870,12 @@
         <w:tc>
           <w:tcPr>
             <w:tcW w:type="dxa" w:w="1440"/>
+            <w:tcBorders>
+              <w:top w:val="single" w:sz="4" w:color="D9D9D9"/>
+              <w:left w:val="single" w:sz="4" w:color="D9D9D9"/>
+              <w:bottom w:val="single" w:sz="4" w:color="D9D9D9"/>
+              <w:right w:val="single" w:sz="4" w:color="D9D9D9"/>
+            </w:tcBorders>
             <w:tcBorders>
               <w:top w:val="single" w:sz="4" w:color="D9D9D9"/>
               <w:left w:val="single" w:sz="4" w:color="D9D9D9"/>
@@ -1543,6 +1905,12 @@
               <w:bottom w:val="single" w:sz="4" w:color="D9D9D9"/>
               <w:right w:val="single" w:sz="4" w:color="D9D9D9"/>
             </w:tcBorders>
+            <w:tcBorders>
+              <w:top w:val="single" w:sz="4" w:color="D9D9D9"/>
+              <w:left w:val="single" w:sz="4" w:color="D9D9D9"/>
+              <w:bottom w:val="single" w:sz="4" w:color="D9D9D9"/>
+              <w:right w:val="single" w:sz="4" w:color="D9D9D9"/>
+            </w:tcBorders>
           </w:tcPr>
           <w:p>
             <w:pPr>
@@ -1560,6 +1928,12 @@
         <w:tc>
           <w:tcPr>
             <w:tcW w:type="dxa" w:w="1584"/>
+            <w:tcBorders>
+              <w:top w:val="single" w:sz="4" w:color="D9D9D9"/>
+              <w:left w:val="single" w:sz="4" w:color="D9D9D9"/>
+              <w:bottom w:val="single" w:sz="4" w:color="D9D9D9"/>
+              <w:right w:val="single" w:sz="4" w:color="D9D9D9"/>
+            </w:tcBorders>
             <w:tcBorders>
               <w:top w:val="single" w:sz="4" w:color="D9D9D9"/>
               <w:left w:val="single" w:sz="4" w:color="D9D9D9"/>
@@ -1584,10 +1958,17 @@
       <w:tr>
         <w:trPr>
           <w:cantSplit/>
+          <w:cantSplit/>
         </w:trPr>
         <w:tc>
           <w:tcPr>
             <w:tcW w:type="dxa" w:w="576"/>
+            <w:tcBorders>
+              <w:top w:val="single" w:sz="4" w:color="D9D9D9"/>
+              <w:left w:val="single" w:sz="4" w:color="D9D9D9"/>
+              <w:bottom w:val="single" w:sz="4" w:color="D9D9D9"/>
+              <w:right w:val="single" w:sz="4" w:color="D9D9D9"/>
+            </w:tcBorders>
             <w:tcBorders>
               <w:top w:val="single" w:sz="4" w:color="D9D9D9"/>
               <w:left w:val="single" w:sz="4" w:color="D9D9D9"/>
@@ -1617,6 +1998,12 @@
               <w:bottom w:val="single" w:sz="4" w:color="D9D9D9"/>
               <w:right w:val="single" w:sz="4" w:color="D9D9D9"/>
             </w:tcBorders>
+            <w:tcBorders>
+              <w:top w:val="single" w:sz="4" w:color="D9D9D9"/>
+              <w:left w:val="single" w:sz="4" w:color="D9D9D9"/>
+              <w:bottom w:val="single" w:sz="4" w:color="D9D9D9"/>
+              <w:right w:val="single" w:sz="4" w:color="D9D9D9"/>
+            </w:tcBorders>
           </w:tcPr>
           <w:p>
             <w:pPr>
@@ -1634,6 +2021,12 @@
         <w:tc>
           <w:tcPr>
             <w:tcW w:type="dxa" w:w="1440"/>
+            <w:tcBorders>
+              <w:top w:val="single" w:sz="4" w:color="D9D9D9"/>
+              <w:left w:val="single" w:sz="4" w:color="D9D9D9"/>
+              <w:bottom w:val="single" w:sz="4" w:color="D9D9D9"/>
+              <w:right w:val="single" w:sz="4" w:color="D9D9D9"/>
+            </w:tcBorders>
             <w:tcBorders>
               <w:top w:val="single" w:sz="4" w:color="D9D9D9"/>
               <w:left w:val="single" w:sz="4" w:color="D9D9D9"/>
@@ -1663,6 +2056,12 @@
               <w:bottom w:val="single" w:sz="4" w:color="D9D9D9"/>
               <w:right w:val="single" w:sz="4" w:color="D9D9D9"/>
             </w:tcBorders>
+            <w:tcBorders>
+              <w:top w:val="single" w:sz="4" w:color="D9D9D9"/>
+              <w:left w:val="single" w:sz="4" w:color="D9D9D9"/>
+              <w:bottom w:val="single" w:sz="4" w:color="D9D9D9"/>
+              <w:right w:val="single" w:sz="4" w:color="D9D9D9"/>
+            </w:tcBorders>
           </w:tcPr>
           <w:p>
             <w:pPr>
@@ -1680,6 +2079,12 @@
         <w:tc>
           <w:tcPr>
             <w:tcW w:type="dxa" w:w="1584"/>
+            <w:tcBorders>
+              <w:top w:val="single" w:sz="4" w:color="D9D9D9"/>
+              <w:left w:val="single" w:sz="4" w:color="D9D9D9"/>
+              <w:bottom w:val="single" w:sz="4" w:color="D9D9D9"/>
+              <w:right w:val="single" w:sz="4" w:color="D9D9D9"/>
+            </w:tcBorders>
             <w:tcBorders>
               <w:top w:val="single" w:sz="4" w:color="D9D9D9"/>
               <w:left w:val="single" w:sz="4" w:color="D9D9D9"/>
@@ -1869,6 +2274,7 @@
         <w:trPr>
           <w:cantSplit/>
           <w:tblHeader/>
+          <w:cantSplit/>
         </w:trPr>
         <w:tc>
           <w:tcPr>
@@ -1880,6 +2286,12 @@
               <w:right w:val="single" w:sz="4" w:color="D9D9D9"/>
             </w:tcBorders>
             <w:shd w:fill="DFE8F2"/>
+            <w:tcBorders>
+              <w:top w:val="single" w:sz="4" w:color="D9D9D9"/>
+              <w:left w:val="single" w:sz="4" w:color="D9D9D9"/>
+              <w:bottom w:val="single" w:sz="4" w:color="D9D9D9"/>
+              <w:right w:val="single" w:sz="4" w:color="D9D9D9"/>
+            </w:tcBorders>
           </w:tcPr>
           <w:p>
             <w:pPr>
@@ -1904,6 +2316,12 @@
               <w:right w:val="single" w:sz="4" w:color="D9D9D9"/>
             </w:tcBorders>
             <w:shd w:fill="DFE8F2"/>
+            <w:tcBorders>
+              <w:top w:val="single" w:sz="4" w:color="D9D9D9"/>
+              <w:left w:val="single" w:sz="4" w:color="D9D9D9"/>
+              <w:bottom w:val="single" w:sz="4" w:color="D9D9D9"/>
+              <w:right w:val="single" w:sz="4" w:color="D9D9D9"/>
+            </w:tcBorders>
           </w:tcPr>
           <w:p>
             <w:pPr>
@@ -1928,6 +2346,12 @@
               <w:right w:val="single" w:sz="4" w:color="D9D9D9"/>
             </w:tcBorders>
             <w:shd w:fill="DFE8F2"/>
+            <w:tcBorders>
+              <w:top w:val="single" w:sz="4" w:color="D9D9D9"/>
+              <w:left w:val="single" w:sz="4" w:color="D9D9D9"/>
+              <w:bottom w:val="single" w:sz="4" w:color="D9D9D9"/>
+              <w:right w:val="single" w:sz="4" w:color="D9D9D9"/>
+            </w:tcBorders>
           </w:tcPr>
           <w:p>
             <w:pPr>
@@ -1946,10 +2370,17 @@
       <w:tr>
         <w:trPr>
           <w:cantSplit/>
+          <w:cantSplit/>
         </w:trPr>
         <w:tc>
           <w:tcPr>
             <w:tcW w:type="dxa" w:w="1800"/>
+            <w:tcBorders>
+              <w:top w:val="single" w:sz="4" w:color="D9D9D9"/>
+              <w:left w:val="single" w:sz="4" w:color="D9D9D9"/>
+              <w:bottom w:val="single" w:sz="4" w:color="D9D9D9"/>
+              <w:right w:val="single" w:sz="4" w:color="D9D9D9"/>
+            </w:tcBorders>
             <w:tcBorders>
               <w:top w:val="single" w:sz="4" w:color="D9D9D9"/>
               <w:left w:val="single" w:sz="4" w:color="D9D9D9"/>
@@ -1979,6 +2410,12 @@
               <w:bottom w:val="single" w:sz="4" w:color="D9D9D9"/>
               <w:right w:val="single" w:sz="4" w:color="D9D9D9"/>
             </w:tcBorders>
+            <w:tcBorders>
+              <w:top w:val="single" w:sz="4" w:color="D9D9D9"/>
+              <w:left w:val="single" w:sz="4" w:color="D9D9D9"/>
+              <w:bottom w:val="single" w:sz="4" w:color="D9D9D9"/>
+              <w:right w:val="single" w:sz="4" w:color="D9D9D9"/>
+            </w:tcBorders>
           </w:tcPr>
           <w:p>
             <w:pPr>
@@ -1996,6 +2433,12 @@
         <w:tc>
           <w:tcPr>
             <w:tcW w:type="dxa" w:w="4464"/>
+            <w:tcBorders>
+              <w:top w:val="single" w:sz="4" w:color="D9D9D9"/>
+              <w:left w:val="single" w:sz="4" w:color="D9D9D9"/>
+              <w:bottom w:val="single" w:sz="4" w:color="D9D9D9"/>
+              <w:right w:val="single" w:sz="4" w:color="D9D9D9"/>
+            </w:tcBorders>
             <w:tcBorders>
               <w:top w:val="single" w:sz="4" w:color="D9D9D9"/>
               <w:left w:val="single" w:sz="4" w:color="D9D9D9"/>
@@ -2020,10 +2463,17 @@
       <w:tr>
         <w:trPr>
           <w:cantSplit/>
+          <w:cantSplit/>
         </w:trPr>
         <w:tc>
           <w:tcPr>
             <w:tcW w:type="dxa" w:w="1800"/>
+            <w:tcBorders>
+              <w:top w:val="single" w:sz="4" w:color="D9D9D9"/>
+              <w:left w:val="single" w:sz="4" w:color="D9D9D9"/>
+              <w:bottom w:val="single" w:sz="4" w:color="D9D9D9"/>
+              <w:right w:val="single" w:sz="4" w:color="D9D9D9"/>
+            </w:tcBorders>
             <w:tcBorders>
               <w:top w:val="single" w:sz="4" w:color="D9D9D9"/>
               <w:left w:val="single" w:sz="4" w:color="D9D9D9"/>
@@ -2053,6 +2503,12 @@
               <w:bottom w:val="single" w:sz="4" w:color="D9D9D9"/>
               <w:right w:val="single" w:sz="4" w:color="D9D9D9"/>
             </w:tcBorders>
+            <w:tcBorders>
+              <w:top w:val="single" w:sz="4" w:color="D9D9D9"/>
+              <w:left w:val="single" w:sz="4" w:color="D9D9D9"/>
+              <w:bottom w:val="single" w:sz="4" w:color="D9D9D9"/>
+              <w:right w:val="single" w:sz="4" w:color="D9D9D9"/>
+            </w:tcBorders>
           </w:tcPr>
           <w:p>
             <w:pPr>
@@ -2070,6 +2526,12 @@
         <w:tc>
           <w:tcPr>
             <w:tcW w:type="dxa" w:w="4464"/>
+            <w:tcBorders>
+              <w:top w:val="single" w:sz="4" w:color="D9D9D9"/>
+              <w:left w:val="single" w:sz="4" w:color="D9D9D9"/>
+              <w:bottom w:val="single" w:sz="4" w:color="D9D9D9"/>
+              <w:right w:val="single" w:sz="4" w:color="D9D9D9"/>
+            </w:tcBorders>
             <w:tcBorders>
               <w:top w:val="single" w:sz="4" w:color="D9D9D9"/>
               <w:left w:val="single" w:sz="4" w:color="D9D9D9"/>
@@ -2094,10 +2556,17 @@
       <w:tr>
         <w:trPr>
           <w:cantSplit/>
+          <w:cantSplit/>
         </w:trPr>
         <w:tc>
           <w:tcPr>
             <w:tcW w:type="dxa" w:w="1800"/>
+            <w:tcBorders>
+              <w:top w:val="single" w:sz="4" w:color="D9D9D9"/>
+              <w:left w:val="single" w:sz="4" w:color="D9D9D9"/>
+              <w:bottom w:val="single" w:sz="4" w:color="D9D9D9"/>
+              <w:right w:val="single" w:sz="4" w:color="D9D9D9"/>
+            </w:tcBorders>
             <w:tcBorders>
               <w:top w:val="single" w:sz="4" w:color="D9D9D9"/>
               <w:left w:val="single" w:sz="4" w:color="D9D9D9"/>
@@ -2127,6 +2596,12 @@
               <w:bottom w:val="single" w:sz="4" w:color="D9D9D9"/>
               <w:right w:val="single" w:sz="4" w:color="D9D9D9"/>
             </w:tcBorders>
+            <w:tcBorders>
+              <w:top w:val="single" w:sz="4" w:color="D9D9D9"/>
+              <w:left w:val="single" w:sz="4" w:color="D9D9D9"/>
+              <w:bottom w:val="single" w:sz="4" w:color="D9D9D9"/>
+              <w:right w:val="single" w:sz="4" w:color="D9D9D9"/>
+            </w:tcBorders>
           </w:tcPr>
           <w:p>
             <w:pPr>
@@ -2144,6 +2619,12 @@
         <w:tc>
           <w:tcPr>
             <w:tcW w:type="dxa" w:w="4464"/>
+            <w:tcBorders>
+              <w:top w:val="single" w:sz="4" w:color="D9D9D9"/>
+              <w:left w:val="single" w:sz="4" w:color="D9D9D9"/>
+              <w:bottom w:val="single" w:sz="4" w:color="D9D9D9"/>
+              <w:right w:val="single" w:sz="4" w:color="D9D9D9"/>
+            </w:tcBorders>
             <w:tcBorders>
               <w:top w:val="single" w:sz="4" w:color="D9D9D9"/>
               <w:left w:val="single" w:sz="4" w:color="D9D9D9"/>
@@ -2168,10 +2649,17 @@
       <w:tr>
         <w:trPr>
           <w:cantSplit/>
+          <w:cantSplit/>
         </w:trPr>
         <w:tc>
           <w:tcPr>
             <w:tcW w:type="dxa" w:w="1800"/>
+            <w:tcBorders>
+              <w:top w:val="single" w:sz="4" w:color="D9D9D9"/>
+              <w:left w:val="single" w:sz="4" w:color="D9D9D9"/>
+              <w:bottom w:val="single" w:sz="4" w:color="D9D9D9"/>
+              <w:right w:val="single" w:sz="4" w:color="D9D9D9"/>
+            </w:tcBorders>
             <w:tcBorders>
               <w:top w:val="single" w:sz="4" w:color="D9D9D9"/>
               <w:left w:val="single" w:sz="4" w:color="D9D9D9"/>
@@ -2201,6 +2689,12 @@
               <w:bottom w:val="single" w:sz="4" w:color="D9D9D9"/>
               <w:right w:val="single" w:sz="4" w:color="D9D9D9"/>
             </w:tcBorders>
+            <w:tcBorders>
+              <w:top w:val="single" w:sz="4" w:color="D9D9D9"/>
+              <w:left w:val="single" w:sz="4" w:color="D9D9D9"/>
+              <w:bottom w:val="single" w:sz="4" w:color="D9D9D9"/>
+              <w:right w:val="single" w:sz="4" w:color="D9D9D9"/>
+            </w:tcBorders>
           </w:tcPr>
           <w:p>
             <w:pPr>
@@ -2218,6 +2712,12 @@
         <w:tc>
           <w:tcPr>
             <w:tcW w:type="dxa" w:w="4464"/>
+            <w:tcBorders>
+              <w:top w:val="single" w:sz="4" w:color="D9D9D9"/>
+              <w:left w:val="single" w:sz="4" w:color="D9D9D9"/>
+              <w:bottom w:val="single" w:sz="4" w:color="D9D9D9"/>
+              <w:right w:val="single" w:sz="4" w:color="D9D9D9"/>
+            </w:tcBorders>
             <w:tcBorders>
               <w:top w:val="single" w:sz="4" w:color="D9D9D9"/>
               <w:left w:val="single" w:sz="4" w:color="D9D9D9"/>
@@ -2259,6 +2759,7 @@
         <w:trPr>
           <w:cantSplit/>
           <w:tblHeader/>
+          <w:cantSplit/>
         </w:trPr>
         <w:tc>
           <w:tcPr>
@@ -2270,6 +2771,12 @@
               <w:right w:val="single" w:sz="4" w:color="D9D9D9"/>
             </w:tcBorders>
             <w:shd w:fill="DFE8F2"/>
+            <w:tcBorders>
+              <w:top w:val="single" w:sz="4" w:color="D9D9D9"/>
+              <w:left w:val="single" w:sz="4" w:color="D9D9D9"/>
+              <w:bottom w:val="single" w:sz="4" w:color="D9D9D9"/>
+              <w:right w:val="single" w:sz="4" w:color="D9D9D9"/>
+            </w:tcBorders>
           </w:tcPr>
           <w:p>
             <w:pPr>
@@ -2294,6 +2801,12 @@
               <w:right w:val="single" w:sz="4" w:color="D9D9D9"/>
             </w:tcBorders>
             <w:shd w:fill="DFE8F2"/>
+            <w:tcBorders>
+              <w:top w:val="single" w:sz="4" w:color="D9D9D9"/>
+              <w:left w:val="single" w:sz="4" w:color="D9D9D9"/>
+              <w:bottom w:val="single" w:sz="4" w:color="D9D9D9"/>
+              <w:right w:val="single" w:sz="4" w:color="D9D9D9"/>
+            </w:tcBorders>
           </w:tcPr>
           <w:p>
             <w:pPr>
@@ -2312,10 +2825,17 @@
       <w:tr>
         <w:trPr>
           <w:cantSplit/>
+          <w:cantSplit/>
         </w:trPr>
         <w:tc>
           <w:tcPr>
             <w:tcW w:type="dxa" w:w="2304"/>
+            <w:tcBorders>
+              <w:top w:val="single" w:sz="4" w:color="D9D9D9"/>
+              <w:left w:val="single" w:sz="4" w:color="D9D9D9"/>
+              <w:bottom w:val="single" w:sz="4" w:color="D9D9D9"/>
+              <w:right w:val="single" w:sz="4" w:color="D9D9D9"/>
+            </w:tcBorders>
             <w:tcBorders>
               <w:top w:val="single" w:sz="4" w:color="D9D9D9"/>
               <w:left w:val="single" w:sz="4" w:color="D9D9D9"/>
@@ -2345,6 +2865,12 @@
               <w:bottom w:val="single" w:sz="4" w:color="D9D9D9"/>
               <w:right w:val="single" w:sz="4" w:color="D9D9D9"/>
             </w:tcBorders>
+            <w:tcBorders>
+              <w:top w:val="single" w:sz="4" w:color="D9D9D9"/>
+              <w:left w:val="single" w:sz="4" w:color="D9D9D9"/>
+              <w:bottom w:val="single" w:sz="4" w:color="D9D9D9"/>
+              <w:right w:val="single" w:sz="4" w:color="D9D9D9"/>
+            </w:tcBorders>
           </w:tcPr>
           <w:p>
             <w:pPr>
@@ -2363,10 +2889,17 @@
       <w:tr>
         <w:trPr>
           <w:cantSplit/>
+          <w:cantSplit/>
         </w:trPr>
         <w:tc>
           <w:tcPr>
             <w:tcW w:type="dxa" w:w="2304"/>
+            <w:tcBorders>
+              <w:top w:val="single" w:sz="4" w:color="D9D9D9"/>
+              <w:left w:val="single" w:sz="4" w:color="D9D9D9"/>
+              <w:bottom w:val="single" w:sz="4" w:color="D9D9D9"/>
+              <w:right w:val="single" w:sz="4" w:color="D9D9D9"/>
+            </w:tcBorders>
             <w:tcBorders>
               <w:top w:val="single" w:sz="4" w:color="D9D9D9"/>
               <w:left w:val="single" w:sz="4" w:color="D9D9D9"/>
@@ -2396,6 +2929,12 @@
               <w:bottom w:val="single" w:sz="4" w:color="D9D9D9"/>
               <w:right w:val="single" w:sz="4" w:color="D9D9D9"/>
             </w:tcBorders>
+            <w:tcBorders>
+              <w:top w:val="single" w:sz="4" w:color="D9D9D9"/>
+              <w:left w:val="single" w:sz="4" w:color="D9D9D9"/>
+              <w:bottom w:val="single" w:sz="4" w:color="D9D9D9"/>
+              <w:right w:val="single" w:sz="4" w:color="D9D9D9"/>
+            </w:tcBorders>
           </w:tcPr>
           <w:p>
             <w:pPr>
@@ -2414,10 +2953,17 @@
       <w:tr>
         <w:trPr>
           <w:cantSplit/>
+          <w:cantSplit/>
         </w:trPr>
         <w:tc>
           <w:tcPr>
             <w:tcW w:type="dxa" w:w="2304"/>
+            <w:tcBorders>
+              <w:top w:val="single" w:sz="4" w:color="D9D9D9"/>
+              <w:left w:val="single" w:sz="4" w:color="D9D9D9"/>
+              <w:bottom w:val="single" w:sz="4" w:color="D9D9D9"/>
+              <w:right w:val="single" w:sz="4" w:color="D9D9D9"/>
+            </w:tcBorders>
             <w:tcBorders>
               <w:top w:val="single" w:sz="4" w:color="D9D9D9"/>
               <w:left w:val="single" w:sz="4" w:color="D9D9D9"/>
@@ -2447,6 +2993,12 @@
               <w:bottom w:val="single" w:sz="4" w:color="D9D9D9"/>
               <w:right w:val="single" w:sz="4" w:color="D9D9D9"/>
             </w:tcBorders>
+            <w:tcBorders>
+              <w:top w:val="single" w:sz="4" w:color="D9D9D9"/>
+              <w:left w:val="single" w:sz="4" w:color="D9D9D9"/>
+              <w:bottom w:val="single" w:sz="4" w:color="D9D9D9"/>
+              <w:right w:val="single" w:sz="4" w:color="D9D9D9"/>
+            </w:tcBorders>
           </w:tcPr>
           <w:p>
             <w:pPr>
@@ -2465,10 +3017,17 @@
       <w:tr>
         <w:trPr>
           <w:cantSplit/>
+          <w:cantSplit/>
         </w:trPr>
         <w:tc>
           <w:tcPr>
             <w:tcW w:type="dxa" w:w="2304"/>
+            <w:tcBorders>
+              <w:top w:val="single" w:sz="4" w:color="D9D9D9"/>
+              <w:left w:val="single" w:sz="4" w:color="D9D9D9"/>
+              <w:bottom w:val="single" w:sz="4" w:color="D9D9D9"/>
+              <w:right w:val="single" w:sz="4" w:color="D9D9D9"/>
+            </w:tcBorders>
             <w:tcBorders>
               <w:top w:val="single" w:sz="4" w:color="D9D9D9"/>
               <w:left w:val="single" w:sz="4" w:color="D9D9D9"/>
@@ -2498,6 +3057,12 @@
               <w:bottom w:val="single" w:sz="4" w:color="D9D9D9"/>
               <w:right w:val="single" w:sz="4" w:color="D9D9D9"/>
             </w:tcBorders>
+            <w:tcBorders>
+              <w:top w:val="single" w:sz="4" w:color="D9D9D9"/>
+              <w:left w:val="single" w:sz="4" w:color="D9D9D9"/>
+              <w:bottom w:val="single" w:sz="4" w:color="D9D9D9"/>
+              <w:right w:val="single" w:sz="4" w:color="D9D9D9"/>
+            </w:tcBorders>
           </w:tcPr>
           <w:p>
             <w:pPr>
@@ -2516,10 +3081,17 @@
       <w:tr>
         <w:trPr>
           <w:cantSplit/>
+          <w:cantSplit/>
         </w:trPr>
         <w:tc>
           <w:tcPr>
             <w:tcW w:type="dxa" w:w="2304"/>
+            <w:tcBorders>
+              <w:top w:val="single" w:sz="4" w:color="D9D9D9"/>
+              <w:left w:val="single" w:sz="4" w:color="D9D9D9"/>
+              <w:bottom w:val="single" w:sz="4" w:color="D9D9D9"/>
+              <w:right w:val="single" w:sz="4" w:color="D9D9D9"/>
+            </w:tcBorders>
             <w:tcBorders>
               <w:top w:val="single" w:sz="4" w:color="D9D9D9"/>
               <w:left w:val="single" w:sz="4" w:color="D9D9D9"/>
@@ -2549,6 +3121,12 @@
               <w:bottom w:val="single" w:sz="4" w:color="D9D9D9"/>
               <w:right w:val="single" w:sz="4" w:color="D9D9D9"/>
             </w:tcBorders>
+            <w:tcBorders>
+              <w:top w:val="single" w:sz="4" w:color="D9D9D9"/>
+              <w:left w:val="single" w:sz="4" w:color="D9D9D9"/>
+              <w:bottom w:val="single" w:sz="4" w:color="D9D9D9"/>
+              <w:right w:val="single" w:sz="4" w:color="D9D9D9"/>
+            </w:tcBorders>
           </w:tcPr>
           <w:p>
             <w:pPr>
@@ -2567,10 +3145,17 @@
       <w:tr>
         <w:trPr>
           <w:cantSplit/>
+          <w:cantSplit/>
         </w:trPr>
         <w:tc>
           <w:tcPr>
             <w:tcW w:type="dxa" w:w="2304"/>
+            <w:tcBorders>
+              <w:top w:val="single" w:sz="4" w:color="D9D9D9"/>
+              <w:left w:val="single" w:sz="4" w:color="D9D9D9"/>
+              <w:bottom w:val="single" w:sz="4" w:color="D9D9D9"/>
+              <w:right w:val="single" w:sz="4" w:color="D9D9D9"/>
+            </w:tcBorders>
             <w:tcBorders>
               <w:top w:val="single" w:sz="4" w:color="D9D9D9"/>
               <w:left w:val="single" w:sz="4" w:color="D9D9D9"/>
@@ -2600,6 +3185,12 @@
               <w:bottom w:val="single" w:sz="4" w:color="D9D9D9"/>
               <w:right w:val="single" w:sz="4" w:color="D9D9D9"/>
             </w:tcBorders>
+            <w:tcBorders>
+              <w:top w:val="single" w:sz="4" w:color="D9D9D9"/>
+              <w:left w:val="single" w:sz="4" w:color="D9D9D9"/>
+              <w:bottom w:val="single" w:sz="4" w:color="D9D9D9"/>
+              <w:right w:val="single" w:sz="4" w:color="D9D9D9"/>
+            </w:tcBorders>
           </w:tcPr>
           <w:p>
             <w:pPr>
@@ -2618,10 +3209,17 @@
       <w:tr>
         <w:trPr>
           <w:cantSplit/>
+          <w:cantSplit/>
         </w:trPr>
         <w:tc>
           <w:tcPr>
             <w:tcW w:type="dxa" w:w="2304"/>
+            <w:tcBorders>
+              <w:top w:val="single" w:sz="4" w:color="D9D9D9"/>
+              <w:left w:val="single" w:sz="4" w:color="D9D9D9"/>
+              <w:bottom w:val="single" w:sz="4" w:color="D9D9D9"/>
+              <w:right w:val="single" w:sz="4" w:color="D9D9D9"/>
+            </w:tcBorders>
             <w:tcBorders>
               <w:top w:val="single" w:sz="4" w:color="D9D9D9"/>
               <w:left w:val="single" w:sz="4" w:color="D9D9D9"/>
@@ -2651,6 +3249,12 @@
               <w:bottom w:val="single" w:sz="4" w:color="D9D9D9"/>
               <w:right w:val="single" w:sz="4" w:color="D9D9D9"/>
             </w:tcBorders>
+            <w:tcBorders>
+              <w:top w:val="single" w:sz="4" w:color="D9D9D9"/>
+              <w:left w:val="single" w:sz="4" w:color="D9D9D9"/>
+              <w:bottom w:val="single" w:sz="4" w:color="D9D9D9"/>
+              <w:right w:val="single" w:sz="4" w:color="D9D9D9"/>
+            </w:tcBorders>
           </w:tcPr>
           <w:p>
             <w:pPr>
@@ -2669,10 +3273,17 @@
       <w:tr>
         <w:trPr>
           <w:cantSplit/>
+          <w:cantSplit/>
         </w:trPr>
         <w:tc>
           <w:tcPr>
             <w:tcW w:type="dxa" w:w="2304"/>
+            <w:tcBorders>
+              <w:top w:val="single" w:sz="4" w:color="D9D9D9"/>
+              <w:left w:val="single" w:sz="4" w:color="D9D9D9"/>
+              <w:bottom w:val="single" w:sz="4" w:color="D9D9D9"/>
+              <w:right w:val="single" w:sz="4" w:color="D9D9D9"/>
+            </w:tcBorders>
             <w:tcBorders>
               <w:top w:val="single" w:sz="4" w:color="D9D9D9"/>
               <w:left w:val="single" w:sz="4" w:color="D9D9D9"/>
@@ -2696,6 +3307,12 @@
         <w:tc>
           <w:tcPr>
             <w:tcW w:type="dxa" w:w="7776"/>
+            <w:tcBorders>
+              <w:top w:val="single" w:sz="4" w:color="D9D9D9"/>
+              <w:left w:val="single" w:sz="4" w:color="D9D9D9"/>
+              <w:bottom w:val="single" w:sz="4" w:color="D9D9D9"/>
+              <w:right w:val="single" w:sz="4" w:color="D9D9D9"/>
+            </w:tcBorders>
             <w:tcBorders>
               <w:top w:val="single" w:sz="4" w:color="D9D9D9"/>
               <w:left w:val="single" w:sz="4" w:color="D9D9D9"/>
@@ -2755,6 +3372,7 @@
         <w:trPr>
           <w:cantSplit/>
           <w:tblHeader/>
+          <w:cantSplit/>
         </w:trPr>
         <w:tc>
           <w:tcPr>
@@ -2766,6 +3384,12 @@
               <w:right w:val="single" w:sz="4" w:color="D9D9D9"/>
             </w:tcBorders>
             <w:shd w:fill="DFE8F2"/>
+            <w:tcBorders>
+              <w:top w:val="single" w:sz="4" w:color="D9D9D9"/>
+              <w:left w:val="single" w:sz="4" w:color="D9D9D9"/>
+              <w:bottom w:val="single" w:sz="4" w:color="D9D9D9"/>
+              <w:right w:val="single" w:sz="4" w:color="D9D9D9"/>
+            </w:tcBorders>
           </w:tcPr>
           <w:p>
             <w:pPr>
@@ -2790,6 +3414,12 @@
               <w:right w:val="single" w:sz="4" w:color="D9D9D9"/>
             </w:tcBorders>
             <w:shd w:fill="DFE8F2"/>
+            <w:tcBorders>
+              <w:top w:val="single" w:sz="4" w:color="D9D9D9"/>
+              <w:left w:val="single" w:sz="4" w:color="D9D9D9"/>
+              <w:bottom w:val="single" w:sz="4" w:color="D9D9D9"/>
+              <w:right w:val="single" w:sz="4" w:color="D9D9D9"/>
+            </w:tcBorders>
           </w:tcPr>
           <w:p>
             <w:pPr>
@@ -2808,10 +3438,17 @@
       <w:tr>
         <w:trPr>
           <w:cantSplit/>
+          <w:cantSplit/>
         </w:trPr>
         <w:tc>
           <w:tcPr>
             <w:tcW w:type="dxa" w:w="2448"/>
+            <w:tcBorders>
+              <w:top w:val="single" w:sz="4" w:color="D9D9D9"/>
+              <w:left w:val="single" w:sz="4" w:color="D9D9D9"/>
+              <w:bottom w:val="single" w:sz="4" w:color="D9D9D9"/>
+              <w:right w:val="single" w:sz="4" w:color="D9D9D9"/>
+            </w:tcBorders>
             <w:tcBorders>
               <w:top w:val="single" w:sz="4" w:color="D9D9D9"/>
               <w:left w:val="single" w:sz="4" w:color="D9D9D9"/>
@@ -2841,6 +3478,12 @@
               <w:bottom w:val="single" w:sz="4" w:color="D9D9D9"/>
               <w:right w:val="single" w:sz="4" w:color="D9D9D9"/>
             </w:tcBorders>
+            <w:tcBorders>
+              <w:top w:val="single" w:sz="4" w:color="D9D9D9"/>
+              <w:left w:val="single" w:sz="4" w:color="D9D9D9"/>
+              <w:bottom w:val="single" w:sz="4" w:color="D9D9D9"/>
+              <w:right w:val="single" w:sz="4" w:color="D9D9D9"/>
+            </w:tcBorders>
           </w:tcPr>
           <w:p>
             <w:pPr>
@@ -2859,10 +3502,17 @@
       <w:tr>
         <w:trPr>
           <w:cantSplit/>
+          <w:cantSplit/>
         </w:trPr>
         <w:tc>
           <w:tcPr>
             <w:tcW w:type="dxa" w:w="2448"/>
+            <w:tcBorders>
+              <w:top w:val="single" w:sz="4" w:color="D9D9D9"/>
+              <w:left w:val="single" w:sz="4" w:color="D9D9D9"/>
+              <w:bottom w:val="single" w:sz="4" w:color="D9D9D9"/>
+              <w:right w:val="single" w:sz="4" w:color="D9D9D9"/>
+            </w:tcBorders>
             <w:tcBorders>
               <w:top w:val="single" w:sz="4" w:color="D9D9D9"/>
               <w:left w:val="single" w:sz="4" w:color="D9D9D9"/>
@@ -2892,6 +3542,12 @@
               <w:bottom w:val="single" w:sz="4" w:color="D9D9D9"/>
               <w:right w:val="single" w:sz="4" w:color="D9D9D9"/>
             </w:tcBorders>
+            <w:tcBorders>
+              <w:top w:val="single" w:sz="4" w:color="D9D9D9"/>
+              <w:left w:val="single" w:sz="4" w:color="D9D9D9"/>
+              <w:bottom w:val="single" w:sz="4" w:color="D9D9D9"/>
+              <w:right w:val="single" w:sz="4" w:color="D9D9D9"/>
+            </w:tcBorders>
           </w:tcPr>
           <w:p>
             <w:pPr>
@@ -2910,6 +3566,7 @@
       <w:tr>
         <w:trPr>
           <w:cantSplit/>
+          <w:cantSplit/>
         </w:trPr>
         <w:tc>
           <w:tcPr>
@@ -2920,16 +3577,165 @@
               <w:bottom w:val="single" w:sz="4" w:color="D9D9D9"/>
               <w:right w:val="single" w:sz="4" w:color="D9D9D9"/>
             </w:tcBorders>
+            <w:tcBorders>
+              <w:top w:val="single" w:sz="4" w:color="D9D9D9"/>
+              <w:left w:val="single" w:sz="4" w:color="D9D9D9"/>
+              <w:bottom w:val="single" w:sz="4" w:color="D9D9D9"/>
+              <w:right w:val="single" w:sz="4" w:color="D9D9D9"/>
+            </w:tcBorders>
           </w:tcPr>
           <w:p>
-            <w:pPr>
-              <w:spacing w:after="80" w:before="80"/>
-            </w:pPr>
             <w:r>
-              <w:rPr>
-                <w:b w:val="0"/>
-                <w:sz w:val="20"/>
-              </w:rPr>
+              <w:t>DataLoader</w:t>
+            </w:r>
+          </w:p>
+        </w:tc>
+        <w:tc>
+          <w:tcPr>
+            <w:tcW w:type="dxa" w:w="7632"/>
+            <w:tcBorders>
+              <w:top w:val="single" w:sz="4" w:color="D9D9D9"/>
+              <w:left w:val="single" w:sz="4" w:color="D9D9D9"/>
+              <w:bottom w:val="single" w:sz="4" w:color="D9D9D9"/>
+              <w:right w:val="single" w:sz="4" w:color="D9D9D9"/>
+            </w:tcBorders>
+            <w:tcBorders>
+              <w:top w:val="single" w:sz="4" w:color="D9D9D9"/>
+              <w:left w:val="single" w:sz="4" w:color="D9D9D9"/>
+              <w:bottom w:val="single" w:sz="4" w:color="D9D9D9"/>
+              <w:right w:val="single" w:sz="4" w:color="D9D9D9"/>
+            </w:tcBorders>
+          </w:tcPr>
+          <w:p>
+            <w:r>
+              <w:t>Batch [2, 3, 224, 224]; nhãn int64 trong khoảng 0–8</w:t>
+            </w:r>
+          </w:p>
+        </w:tc>
+      </w:tr>
+      <w:tr>
+        <w:trPr>
+          <w:cantSplit/>
+          <w:cantSplit/>
+        </w:trPr>
+        <w:tc>
+          <w:tcPr>
+            <w:tcW w:type="dxa" w:w="2448"/>
+            <w:tcBorders>
+              <w:top w:val="single" w:sz="4" w:color="D9D9D9"/>
+              <w:left w:val="single" w:sz="4" w:color="D9D9D9"/>
+              <w:bottom w:val="single" w:sz="4" w:color="D9D9D9"/>
+              <w:right w:val="single" w:sz="4" w:color="D9D9D9"/>
+            </w:tcBorders>
+            <w:tcBorders>
+              <w:top w:val="single" w:sz="4" w:color="D9D9D9"/>
+              <w:left w:val="single" w:sz="4" w:color="D9D9D9"/>
+              <w:bottom w:val="single" w:sz="4" w:color="D9D9D9"/>
+              <w:right w:val="single" w:sz="4" w:color="D9D9D9"/>
+            </w:tcBorders>
+          </w:tcPr>
+          <w:p>
+            <w:r>
+              <w:t>Kiểm tra hai mô hình</w:t>
+            </w:r>
+          </w:p>
+        </w:tc>
+        <w:tc>
+          <w:tcPr>
+            <w:tcW w:type="dxa" w:w="7632"/>
+            <w:tcBorders>
+              <w:top w:val="single" w:sz="4" w:color="D9D9D9"/>
+              <w:left w:val="single" w:sz="4" w:color="D9D9D9"/>
+              <w:bottom w:val="single" w:sz="4" w:color="D9D9D9"/>
+              <w:right w:val="single" w:sz="4" w:color="D9D9D9"/>
+            </w:tcBorders>
+            <w:tcBorders>
+              <w:top w:val="single" w:sz="4" w:color="D9D9D9"/>
+              <w:left w:val="single" w:sz="4" w:color="D9D9D9"/>
+              <w:bottom w:val="single" w:sz="4" w:color="D9D9D9"/>
+              <w:right w:val="single" w:sz="4" w:color="D9D9D9"/>
+            </w:tcBorders>
+          </w:tcPr>
+          <w:p>
+            <w:r>
+              <w:t>ViT và ResNet-18; mỗi mô hình 20 batch train, 10 batch validation</w:t>
+            </w:r>
+          </w:p>
+        </w:tc>
+      </w:tr>
+      <w:tr>
+        <w:trPr>
+          <w:cantSplit/>
+          <w:cantSplit/>
+        </w:trPr>
+        <w:tc>
+          <w:tcPr>
+            <w:tcW w:type="dxa" w:w="2448"/>
+            <w:tcBorders>
+              <w:top w:val="single" w:sz="4" w:color="D9D9D9"/>
+              <w:left w:val="single" w:sz="4" w:color="D9D9D9"/>
+              <w:bottom w:val="single" w:sz="4" w:color="D9D9D9"/>
+              <w:right w:val="single" w:sz="4" w:color="D9D9D9"/>
+            </w:tcBorders>
+            <w:tcBorders>
+              <w:top w:val="single" w:sz="4" w:color="D9D9D9"/>
+              <w:left w:val="single" w:sz="4" w:color="D9D9D9"/>
+              <w:bottom w:val="single" w:sz="4" w:color="D9D9D9"/>
+              <w:right w:val="single" w:sz="4" w:color="D9D9D9"/>
+            </w:tcBorders>
+          </w:tcPr>
+          <w:p>
+            <w:r>
+              <w:t>Phạm vi đo</w:t>
+            </w:r>
+          </w:p>
+        </w:tc>
+        <w:tc>
+          <w:tcPr>
+            <w:tcW w:type="dxa" w:w="7632"/>
+            <w:tcBorders>
+              <w:top w:val="single" w:sz="4" w:color="D9D9D9"/>
+              <w:left w:val="single" w:sz="4" w:color="D9D9D9"/>
+              <w:bottom w:val="single" w:sz="4" w:color="D9D9D9"/>
+              <w:right w:val="single" w:sz="4" w:color="D9D9D9"/>
+            </w:tcBorders>
+            <w:tcBorders>
+              <w:top w:val="single" w:sz="4" w:color="D9D9D9"/>
+              <w:left w:val="single" w:sz="4" w:color="D9D9D9"/>
+              <w:bottom w:val="single" w:sz="4" w:color="D9D9D9"/>
+              <w:right w:val="single" w:sz="4" w:color="D9D9D9"/>
+            </w:tcBorders>
+          </w:tcPr>
+          <w:p>
+            <w:r>
+              <w:t>Thời gian phép thử và VRAM PyTorch cấp phát; số liệu chi tiết ở bảng dưới</w:t>
+            </w:r>
+          </w:p>
+        </w:tc>
+      </w:tr>
+      <w:tr>
+        <w:trPr>
+          <w:cantSplit/>
+          <w:cantSplit/>
+        </w:trPr>
+        <w:tc>
+          <w:tcPr>
+            <w:tcW w:type="dxa" w:w="2448"/>
+            <w:tcBorders>
+              <w:top w:val="single" w:sz="4" w:color="D9D9D9"/>
+              <w:left w:val="single" w:sz="4" w:color="D9D9D9"/>
+              <w:bottom w:val="single" w:sz="4" w:color="D9D9D9"/>
+              <w:right w:val="single" w:sz="4" w:color="D9D9D9"/>
+            </w:tcBorders>
+            <w:tcBorders>
+              <w:top w:val="single" w:sz="4" w:color="D9D9D9"/>
+              <w:left w:val="single" w:sz="4" w:color="D9D9D9"/>
+              <w:bottom w:val="single" w:sz="4" w:color="D9D9D9"/>
+              <w:right w:val="single" w:sz="4" w:color="D9D9D9"/>
+            </w:tcBorders>
+          </w:tcPr>
+          <w:p>
+            <w:r>
               <w:t>GPU</w:t>
             </w:r>
           </w:p>
@@ -2943,17 +3749,103 @@
               <w:bottom w:val="single" w:sz="4" w:color="D9D9D9"/>
               <w:right w:val="single" w:sz="4" w:color="D9D9D9"/>
             </w:tcBorders>
+            <w:tcBorders>
+              <w:top w:val="single" w:sz="4" w:color="D9D9D9"/>
+              <w:left w:val="single" w:sz="4" w:color="D9D9D9"/>
+              <w:bottom w:val="single" w:sz="4" w:color="D9D9D9"/>
+              <w:right w:val="single" w:sz="4" w:color="D9D9D9"/>
+            </w:tcBorders>
           </w:tcPr>
           <w:p>
-            <w:pPr>
-              <w:spacing w:after="80" w:before="80"/>
-            </w:pPr>
+            <w:r>
+              <w:t>NVIDIA GeForce RTX 3050 Ti Laptop GPU; CUDA khả dụng</w:t>
+            </w:r>
+          </w:p>
+        </w:tc>
+      </w:tr>
+    </w:tbl>
+    <w:p>
+      <w:r>
+        <w:t>Minh chứng lấy từ A1/results/vit_pipeline_check.json và A1/results/resnet18_pipeline_check.json [3]. Mỗi mô hình đã chạy thử 20 batch train (40 ảnh) và 10 batch validation (20 ảnh), gồm forward, backward, optimizer step và validation. Kiểm tra pipeline trên tập nhỏ; chưa dùng để kết luận mô hình nào tốt hơn. Thời gian không đại diện cho một epoch; VRAM là đỉnh bộ nhớ được PyTorch cấp phát, không phải tổng bộ nhớ GPU. Không dùng các số liệu này làm kết quả A1.2.</w:t>
+      </w:r>
+    </w:p>
+    <w:p>
+      <w:r>
+        <w:rPr>
+          <w:b/>
+        </w:rPr>
+        <w:t>Bảng kết quả kiểm tra pipeline trên tập nhỏ</w:t>
+      </w:r>
+    </w:p>
+    <w:tbl>
+      <w:tblPr>
+        <w:tblStyle w:val="TableGrid"/>
+        <w:tblW w:type="auto" w:w="0"/>
+        <w:tblLook w:firstColumn="1" w:firstRow="1" w:lastColumn="0" w:lastRow="0" w:noHBand="0" w:noVBand="1" w:val="04A0"/>
+      </w:tblPr>
+      <w:tblGrid>
+        <w:gridCol w:w="3360"/>
+        <w:gridCol w:w="3360"/>
+        <w:gridCol w:w="3360"/>
+      </w:tblGrid>
+      <w:tr>
+        <w:trPr>
+          <w:cantSplit/>
+        </w:trPr>
+        <w:tc>
+          <w:tcPr>
+            <w:tcW w:type="dxa" w:w="3360"/>
+            <w:tcBorders>
+              <w:top w:val="single" w:sz="4" w:color="D9D9D9"/>
+              <w:left w:val="single" w:sz="4" w:color="D9D9D9"/>
+              <w:bottom w:val="single" w:sz="4" w:color="D9D9D9"/>
+              <w:right w:val="single" w:sz="4" w:color="D9D9D9"/>
+            </w:tcBorders>
+          </w:tcPr>
+          <w:p>
             <w:r>
               <w:rPr>
-                <w:b w:val="0"/>
                 <w:sz w:val="20"/>
               </w:rPr>
-              <w:t>NVIDIA GeForce RTX 3050 Ti Laptop GPU; CUDA khả dụng</w:t>
+              <w:t>Chỉ số</w:t>
+            </w:r>
+          </w:p>
+        </w:tc>
+        <w:tc>
+          <w:tcPr>
+            <w:tcW w:type="dxa" w:w="3360"/>
+            <w:tcBorders>
+              <w:top w:val="single" w:sz="4" w:color="D9D9D9"/>
+              <w:left w:val="single" w:sz="4" w:color="D9D9D9"/>
+              <w:bottom w:val="single" w:sz="4" w:color="D9D9D9"/>
+              <w:right w:val="single" w:sz="4" w:color="D9D9D9"/>
+            </w:tcBorders>
+          </w:tcPr>
+          <w:p>
+            <w:r>
+              <w:rPr>
+                <w:sz w:val="20"/>
+              </w:rPr>
+              <w:t>ViT Base 16</w:t>
+            </w:r>
+          </w:p>
+        </w:tc>
+        <w:tc>
+          <w:tcPr>
+            <w:tcW w:type="dxa" w:w="3360"/>
+            <w:tcBorders>
+              <w:top w:val="single" w:sz="4" w:color="D9D9D9"/>
+              <w:left w:val="single" w:sz="4" w:color="D9D9D9"/>
+              <w:bottom w:val="single" w:sz="4" w:color="D9D9D9"/>
+              <w:right w:val="single" w:sz="4" w:color="D9D9D9"/>
+            </w:tcBorders>
+          </w:tcPr>
+          <w:p>
+            <w:r>
+              <w:rPr>
+                <w:sz w:val="20"/>
+              </w:rPr>
+              <w:t>ResNet 18</w:t>
             </w:r>
           </w:p>
         </w:tc>
@@ -2964,7 +3856,7 @@
         </w:trPr>
         <w:tc>
           <w:tcPr>
-            <w:tcW w:type="dxa" w:w="2448"/>
+            <w:tcW w:type="dxa" w:w="3360"/>
             <w:tcBorders>
               <w:top w:val="single" w:sz="4" w:color="D9D9D9"/>
               <w:left w:val="single" w:sz="4" w:color="D9D9D9"/>
@@ -2973,21 +3865,17 @@
             </w:tcBorders>
           </w:tcPr>
           <w:p>
-            <w:pPr>
-              <w:spacing w:after="80" w:before="80"/>
-            </w:pPr>
             <w:r>
               <w:rPr>
-                <w:b w:val="0"/>
                 <w:sz w:val="20"/>
               </w:rPr>
-              <w:t>DataLoader</w:t>
+              <w:t>Train batch / ảnh</w:t>
             </w:r>
           </w:p>
         </w:tc>
         <w:tc>
           <w:tcPr>
-            <w:tcW w:type="dxa" w:w="7632"/>
+            <w:tcW w:type="dxa" w:w="3360"/>
             <w:tcBorders>
               <w:top w:val="single" w:sz="4" w:color="D9D9D9"/>
               <w:left w:val="single" w:sz="4" w:color="D9D9D9"/>
@@ -2996,15 +3884,30 @@
             </w:tcBorders>
           </w:tcPr>
           <w:p>
-            <w:pPr>
-              <w:spacing w:after="80" w:before="80"/>
-            </w:pPr>
             <w:r>
               <w:rPr>
-                <w:b w:val="0"/>
                 <w:sz w:val="20"/>
               </w:rPr>
-              <w:t>Batch [2, 3, 224, 224]; nhãn int64, trong khoảng 0–8</w:t>
+              <w:t>20 / 40</w:t>
+            </w:r>
+          </w:p>
+        </w:tc>
+        <w:tc>
+          <w:tcPr>
+            <w:tcW w:type="dxa" w:w="3360"/>
+            <w:tcBorders>
+              <w:top w:val="single" w:sz="4" w:color="D9D9D9"/>
+              <w:left w:val="single" w:sz="4" w:color="D9D9D9"/>
+              <w:bottom w:val="single" w:sz="4" w:color="D9D9D9"/>
+              <w:right w:val="single" w:sz="4" w:color="D9D9D9"/>
+            </w:tcBorders>
+          </w:tcPr>
+          <w:p>
+            <w:r>
+              <w:rPr>
+                <w:sz w:val="20"/>
+              </w:rPr>
+              <w:t>20 / 40</w:t>
             </w:r>
           </w:p>
         </w:tc>
@@ -3015,7 +3918,7 @@
         </w:trPr>
         <w:tc>
           <w:tcPr>
-            <w:tcW w:type="dxa" w:w="2448"/>
+            <w:tcW w:type="dxa" w:w="3360"/>
             <w:tcBorders>
               <w:top w:val="single" w:sz="4" w:color="D9D9D9"/>
               <w:left w:val="single" w:sz="4" w:color="D9D9D9"/>
@@ -3024,21 +3927,17 @@
             </w:tcBorders>
           </w:tcPr>
           <w:p>
-            <w:pPr>
-              <w:spacing w:after="80" w:before="80"/>
-            </w:pPr>
             <w:r>
               <w:rPr>
-                <w:b w:val="0"/>
                 <w:sz w:val="20"/>
               </w:rPr>
-              <w:t>Kiểm tra ViT</w:t>
+              <w:t>Validation batch / ảnh</w:t>
             </w:r>
           </w:p>
         </w:tc>
         <w:tc>
           <w:tcPr>
-            <w:tcW w:type="dxa" w:w="7632"/>
+            <w:tcW w:type="dxa" w:w="3360"/>
             <w:tcBorders>
               <w:top w:val="single" w:sz="4" w:color="D9D9D9"/>
               <w:left w:val="single" w:sz="4" w:color="D9D9D9"/>
@@ -3047,15 +3946,30 @@
             </w:tcBorders>
           </w:tcPr>
           <w:p>
-            <w:pPr>
-              <w:spacing w:after="80" w:before="80"/>
-            </w:pPr>
             <w:r>
               <w:rPr>
-                <w:b w:val="0"/>
                 <w:sz w:val="20"/>
               </w:rPr>
-              <w:t>20 batch train (40 ảnh); 10 batch validation (20 ảnh)</w:t>
+              <w:t>10 / 20</w:t>
+            </w:r>
+          </w:p>
+        </w:tc>
+        <w:tc>
+          <w:tcPr>
+            <w:tcW w:type="dxa" w:w="3360"/>
+            <w:tcBorders>
+              <w:top w:val="single" w:sz="4" w:color="D9D9D9"/>
+              <w:left w:val="single" w:sz="4" w:color="D9D9D9"/>
+              <w:bottom w:val="single" w:sz="4" w:color="D9D9D9"/>
+              <w:right w:val="single" w:sz="4" w:color="D9D9D9"/>
+            </w:tcBorders>
+          </w:tcPr>
+          <w:p>
+            <w:r>
+              <w:rPr>
+                <w:sz w:val="20"/>
+              </w:rPr>
+              <w:t>10 / 20</w:t>
             </w:r>
           </w:p>
         </w:tc>
@@ -3066,7 +3980,7 @@
         </w:trPr>
         <w:tc>
           <w:tcPr>
-            <w:tcW w:type="dxa" w:w="2448"/>
+            <w:tcW w:type="dxa" w:w="3360"/>
             <w:tcBorders>
               <w:top w:val="single" w:sz="4" w:color="D9D9D9"/>
               <w:left w:val="single" w:sz="4" w:color="D9D9D9"/>
@@ -3075,21 +3989,17 @@
             </w:tcBorders>
           </w:tcPr>
           <w:p>
-            <w:pPr>
-              <w:spacing w:after="80" w:before="80"/>
-            </w:pPr>
             <w:r>
               <w:rPr>
-                <w:b w:val="0"/>
                 <w:sz w:val="20"/>
               </w:rPr>
-              <w:t>Bộ nhớ và thời gian</w:t>
+              <w:t>Train loss</w:t>
             </w:r>
           </w:p>
         </w:tc>
         <w:tc>
           <w:tcPr>
-            <w:tcW w:type="dxa" w:w="7632"/>
+            <w:tcW w:type="dxa" w:w="3360"/>
             <w:tcBorders>
               <w:top w:val="single" w:sz="4" w:color="D9D9D9"/>
               <w:left w:val="single" w:sz="4" w:color="D9D9D9"/>
@@ -3098,15 +4008,278 @@
             </w:tcBorders>
           </w:tcPr>
           <w:p>
-            <w:pPr>
-              <w:spacing w:after="80" w:before="80"/>
-            </w:pPr>
             <w:r>
               <w:rPr>
-                <w:b w:val="0"/>
                 <w:sz w:val="20"/>
               </w:rPr>
-              <w:t>VRAM PyTorch cấp phát đỉnh 1,6227 GB; thời gian phép thử 2,1234 giây</w:t>
+              <w:t>2,332422</w:t>
+            </w:r>
+          </w:p>
+        </w:tc>
+        <w:tc>
+          <w:tcPr>
+            <w:tcW w:type="dxa" w:w="3360"/>
+            <w:tcBorders>
+              <w:top w:val="single" w:sz="4" w:color="D9D9D9"/>
+              <w:left w:val="single" w:sz="4" w:color="D9D9D9"/>
+              <w:bottom w:val="single" w:sz="4" w:color="D9D9D9"/>
+              <w:right w:val="single" w:sz="4" w:color="D9D9D9"/>
+            </w:tcBorders>
+          </w:tcPr>
+          <w:p>
+            <w:r>
+              <w:rPr>
+                <w:sz w:val="20"/>
+              </w:rPr>
+              <w:t>2,447534</w:t>
+            </w:r>
+          </w:p>
+        </w:tc>
+      </w:tr>
+      <w:tr>
+        <w:trPr>
+          <w:cantSplit/>
+        </w:trPr>
+        <w:tc>
+          <w:tcPr>
+            <w:tcW w:type="dxa" w:w="3360"/>
+            <w:tcBorders>
+              <w:top w:val="single" w:sz="4" w:color="D9D9D9"/>
+              <w:left w:val="single" w:sz="4" w:color="D9D9D9"/>
+              <w:bottom w:val="single" w:sz="4" w:color="D9D9D9"/>
+              <w:right w:val="single" w:sz="4" w:color="D9D9D9"/>
+            </w:tcBorders>
+          </w:tcPr>
+          <w:p>
+            <w:r>
+              <w:rPr>
+                <w:sz w:val="20"/>
+              </w:rPr>
+              <w:t>Validation loss</w:t>
+            </w:r>
+          </w:p>
+        </w:tc>
+        <w:tc>
+          <w:tcPr>
+            <w:tcW w:type="dxa" w:w="3360"/>
+            <w:tcBorders>
+              <w:top w:val="single" w:sz="4" w:color="D9D9D9"/>
+              <w:left w:val="single" w:sz="4" w:color="D9D9D9"/>
+              <w:bottom w:val="single" w:sz="4" w:color="D9D9D9"/>
+              <w:right w:val="single" w:sz="4" w:color="D9D9D9"/>
+            </w:tcBorders>
+          </w:tcPr>
+          <w:p>
+            <w:r>
+              <w:rPr>
+                <w:sz w:val="20"/>
+              </w:rPr>
+              <w:t>2,290479</w:t>
+            </w:r>
+          </w:p>
+        </w:tc>
+        <w:tc>
+          <w:tcPr>
+            <w:tcW w:type="dxa" w:w="3360"/>
+            <w:tcBorders>
+              <w:top w:val="single" w:sz="4" w:color="D9D9D9"/>
+              <w:left w:val="single" w:sz="4" w:color="D9D9D9"/>
+              <w:bottom w:val="single" w:sz="4" w:color="D9D9D9"/>
+              <w:right w:val="single" w:sz="4" w:color="D9D9D9"/>
+            </w:tcBorders>
+          </w:tcPr>
+          <w:p>
+            <w:r>
+              <w:rPr>
+                <w:sz w:val="20"/>
+              </w:rPr>
+              <w:t>2,239258</w:t>
+            </w:r>
+          </w:p>
+        </w:tc>
+      </w:tr>
+      <w:tr>
+        <w:trPr>
+          <w:cantSplit/>
+        </w:trPr>
+        <w:tc>
+          <w:tcPr>
+            <w:tcW w:type="dxa" w:w="3360"/>
+            <w:tcBorders>
+              <w:top w:val="single" w:sz="4" w:color="D9D9D9"/>
+              <w:left w:val="single" w:sz="4" w:color="D9D9D9"/>
+              <w:bottom w:val="single" w:sz="4" w:color="D9D9D9"/>
+              <w:right w:val="single" w:sz="4" w:color="D9D9D9"/>
+            </w:tcBorders>
+          </w:tcPr>
+          <w:p>
+            <w:r>
+              <w:rPr>
+                <w:sz w:val="20"/>
+              </w:rPr>
+              <w:t>Accuracy trên 20 ảnh validation</w:t>
+            </w:r>
+          </w:p>
+        </w:tc>
+        <w:tc>
+          <w:tcPr>
+            <w:tcW w:type="dxa" w:w="3360"/>
+            <w:tcBorders>
+              <w:top w:val="single" w:sz="4" w:color="D9D9D9"/>
+              <w:left w:val="single" w:sz="4" w:color="D9D9D9"/>
+              <w:bottom w:val="single" w:sz="4" w:color="D9D9D9"/>
+              <w:right w:val="single" w:sz="4" w:color="D9D9D9"/>
+            </w:tcBorders>
+          </w:tcPr>
+          <w:p>
+            <w:r>
+              <w:rPr>
+                <w:sz w:val="20"/>
+              </w:rPr>
+              <w:t>0,00%</w:t>
+            </w:r>
+          </w:p>
+        </w:tc>
+        <w:tc>
+          <w:tcPr>
+            <w:tcW w:type="dxa" w:w="3360"/>
+            <w:tcBorders>
+              <w:top w:val="single" w:sz="4" w:color="D9D9D9"/>
+              <w:left w:val="single" w:sz="4" w:color="D9D9D9"/>
+              <w:bottom w:val="single" w:sz="4" w:color="D9D9D9"/>
+              <w:right w:val="single" w:sz="4" w:color="D9D9D9"/>
+            </w:tcBorders>
+          </w:tcPr>
+          <w:p>
+            <w:r>
+              <w:rPr>
+                <w:sz w:val="20"/>
+              </w:rPr>
+              <w:t>30,00%</w:t>
+            </w:r>
+          </w:p>
+        </w:tc>
+      </w:tr>
+      <w:tr>
+        <w:trPr>
+          <w:cantSplit/>
+        </w:trPr>
+        <w:tc>
+          <w:tcPr>
+            <w:tcW w:type="dxa" w:w="3360"/>
+            <w:tcBorders>
+              <w:top w:val="single" w:sz="4" w:color="D9D9D9"/>
+              <w:left w:val="single" w:sz="4" w:color="D9D9D9"/>
+              <w:bottom w:val="single" w:sz="4" w:color="D9D9D9"/>
+              <w:right w:val="single" w:sz="4" w:color="D9D9D9"/>
+            </w:tcBorders>
+          </w:tcPr>
+          <w:p>
+            <w:r>
+              <w:rPr>
+                <w:sz w:val="20"/>
+              </w:rPr>
+              <w:t>Thời gian phép thử giây</w:t>
+            </w:r>
+          </w:p>
+        </w:tc>
+        <w:tc>
+          <w:tcPr>
+            <w:tcW w:type="dxa" w:w="3360"/>
+            <w:tcBorders>
+              <w:top w:val="single" w:sz="4" w:color="D9D9D9"/>
+              <w:left w:val="single" w:sz="4" w:color="D9D9D9"/>
+              <w:bottom w:val="single" w:sz="4" w:color="D9D9D9"/>
+              <w:right w:val="single" w:sz="4" w:color="D9D9D9"/>
+            </w:tcBorders>
+          </w:tcPr>
+          <w:p>
+            <w:r>
+              <w:rPr>
+                <w:sz w:val="20"/>
+              </w:rPr>
+              <w:t>2,258979</w:t>
+            </w:r>
+          </w:p>
+        </w:tc>
+        <w:tc>
+          <w:tcPr>
+            <w:tcW w:type="dxa" w:w="3360"/>
+            <w:tcBorders>
+              <w:top w:val="single" w:sz="4" w:color="D9D9D9"/>
+              <w:left w:val="single" w:sz="4" w:color="D9D9D9"/>
+              <w:bottom w:val="single" w:sz="4" w:color="D9D9D9"/>
+              <w:right w:val="single" w:sz="4" w:color="D9D9D9"/>
+            </w:tcBorders>
+          </w:tcPr>
+          <w:p>
+            <w:r>
+              <w:rPr>
+                <w:sz w:val="20"/>
+              </w:rPr>
+              <w:t>0,890103</w:t>
+            </w:r>
+          </w:p>
+        </w:tc>
+      </w:tr>
+      <w:tr>
+        <w:trPr>
+          <w:cantSplit/>
+        </w:trPr>
+        <w:tc>
+          <w:tcPr>
+            <w:tcW w:type="dxa" w:w="3360"/>
+            <w:tcBorders>
+              <w:top w:val="single" w:sz="4" w:color="D9D9D9"/>
+              <w:left w:val="single" w:sz="4" w:color="D9D9D9"/>
+              <w:bottom w:val="single" w:sz="4" w:color="D9D9D9"/>
+              <w:right w:val="single" w:sz="4" w:color="D9D9D9"/>
+            </w:tcBorders>
+          </w:tcPr>
+          <w:p>
+            <w:r>
+              <w:rPr>
+                <w:sz w:val="20"/>
+              </w:rPr>
+              <w:t>VRAM đỉnh GB theo JSON</w:t>
+            </w:r>
+          </w:p>
+        </w:tc>
+        <w:tc>
+          <w:tcPr>
+            <w:tcW w:type="dxa" w:w="3360"/>
+            <w:tcBorders>
+              <w:top w:val="single" w:sz="4" w:color="D9D9D9"/>
+              <w:left w:val="single" w:sz="4" w:color="D9D9D9"/>
+              <w:bottom w:val="single" w:sz="4" w:color="D9D9D9"/>
+              <w:right w:val="single" w:sz="4" w:color="D9D9D9"/>
+            </w:tcBorders>
+          </w:tcPr>
+          <w:p>
+            <w:r>
+              <w:rPr>
+                <w:sz w:val="20"/>
+              </w:rPr>
+              <w:t>1,621982</w:t>
+            </w:r>
+          </w:p>
+        </w:tc>
+        <w:tc>
+          <w:tcPr>
+            <w:tcW w:type="dxa" w:w="3360"/>
+            <w:tcBorders>
+              <w:top w:val="single" w:sz="4" w:color="D9D9D9"/>
+              <w:left w:val="single" w:sz="4" w:color="D9D9D9"/>
+              <w:bottom w:val="single" w:sz="4" w:color="D9D9D9"/>
+              <w:right w:val="single" w:sz="4" w:color="D9D9D9"/>
+            </w:tcBorders>
+          </w:tcPr>
+          <w:p>
+            <w:r>
+              <w:rPr>
+                <w:sz w:val="20"/>
+              </w:rPr>
+              <w:t>0,752887</w:t>
             </w:r>
           </w:p>
         </w:tc>
@@ -3114,7 +4287,51 @@
     </w:tbl>
     <w:p>
       <w:r>
-        <w:t>Minh chứng lấy từ A1/results/vit_pipeline_check.json [3]. Phép thử đã hoàn tất forward, backward, optimizer step và validation. Số ảnh quá nhỏ để kết luận chất lượng mô hình; thời gian trên không đại diện cho một epoch và VRAM cấp phát không phải tổng bộ nhớ GPU. Không dùng accuracy/loss của phép thử làm kết quả A1.2.</w:t>
+        <w:t>Nguồn số liệu: hai JSON hiển thị trong ảnh minh chứng ngày 25/10/2026. Số liệu được làm tròn đến 6 chữ số thập phân. Accuracy khác nhau trên 20 ảnh không chứng minh ưu thế mô hình; các phép thử chưa kiểm soát đầy đủ điều kiện để so sánh tốc độ hoặc bộ nhớ. Đơn vị GB trong JSON được tính bằng byte / 1024³.</w:t>
+      </w:r>
+    </w:p>
+    <w:p>
+      <w:r>
+        <w:drawing>
+          <wp:inline xmlns:a="http://schemas.openxmlformats.org/drawingml/2006/main" xmlns:pic="http://schemas.openxmlformats.org/drawingml/2006/picture">
+            <wp:extent cx="5669280" cy="2988697"/>
+            <wp:docPr id="3" name="Picture 3"/>
+            <wp:cNvGraphicFramePr>
+              <a:graphicFrameLocks noChangeAspect="1"/>
+            </wp:cNvGraphicFramePr>
+            <a:graphic>
+              <a:graphicData uri="http://schemas.openxmlformats.org/drawingml/2006/picture">
+                <pic:pic>
+                  <pic:nvPicPr>
+                    <pic:cNvPr id="0" name="image(20261025-081512).png"/>
+                    <pic:cNvPicPr/>
+                  </pic:nvPicPr>
+                  <pic:blipFill>
+                    <a:blip r:embed="rId13"/>
+                    <a:stretch>
+                      <a:fillRect/>
+                    </a:stretch>
+                  </pic:blipFill>
+                  <pic:spPr>
+                    <a:xfrm>
+                      <a:off x="0" y="0"/>
+                      <a:ext cx="5669280" cy="2988697"/>
+                    </a:xfrm>
+                    <a:prstGeom prst="rect"/>
+                  </pic:spPr>
+                </pic:pic>
+              </a:graphicData>
+            </a:graphic>
+          </wp:inline>
+        </w:drawing>
+      </w:r>
+    </w:p>
+    <w:p>
+      <w:pPr>
+        <w:keepNext w:val="0"/>
+      </w:pPr>
+      <w:r>
+        <w:t>Hình 3 Nội dung JSON kiểm tra pipeline ViT và ResNet 18 từ PowerShell</w:t>
       </w:r>
     </w:p>
     <w:p>
@@ -3132,12 +4349,12 @@
     </w:p>
     <w:p>
       <w:r>
-        <w:t>Đã hoàn thành môi trường, dữ liệu, EDA, DataLoader và kiểm tra ViT. Chưa hoàn thành kiểm tra CNN, tám thí nghiệm chính, đánh giá test và so sánh cuối. A1.1 nộp dataset + protocol vào 26/10/2026; A1.2 dự kiến hoàn thiện trước 09/11/2026 theo đề chi tiết [5]. YOLO Detection là phần thực hành riêng, chưa có kết quả fine-tune trong báo cáo này.</w:t>
+        <w:t>Đã hoàn thành môi trường, dữ liệu, EDA, DataLoader và kiểm tra ViT và ResNet-18. Chưa hoàn thành tám thí nghiệm chính, đánh giá test và so sánh cuối. A1.1 nộp dataset + protocol vào 26/10/2026; A1.2 dự kiến hoàn thiện trước 09/11/2026 theo đề chi tiết [5]. YOLO Detection là phần thực hành riêng, chưa có kết quả fine-tune trong báo cáo này.</w:t>
       </w:r>
     </w:p>
     <w:p>
       <w:r>
-        <w:t>Để chạy lại: tải pathmnist.npz vào A1/data; mở A1/MedMNIST-ViT-main/PathMNIST.ipynb, chọn kernel A1 và sửa data_path theo máy. Chạy các ô kiểm tra đã bổ sung theo thứ tự; không dùng Run All với các ô gốc chưa điều chỉnh. Phiên bản thư viện được lưu tại A1/requirements-lock.txt. File dữ liệu và môi trường ảo không đưa lên GitHub.</w:t>
+        <w:t>Để chạy lại: tải pathmnist.npz vào A1/data; mở A1/PathMNIST_A1_1.ipynb, chọn kernel A1 và chạy các ô theo thứ tự từ thư mục A1 hoặc gốc repository. Notebook dùng đường dẫn tương đối và DataLoader riêng cho ResNet-18 với normalization ImageNet. Hướng dẫn cài đặt nằm trong A1/README.md và A1/requirements-a1.txt; bản chụp môi trường được lưu tại A1/requirements-lock.txt. File dữ liệu và môi trường ảo không đưa lên GitHub.</w:t>
       </w:r>
     </w:p>
     <w:p>

</xml_diff>